<commit_message>
Update entregable capitulo1 17 SEPT V0.0.1.docx
</commit_message>
<xml_diff>
--- a/PropuestaProyecto/entregable capitulo1 17 SEPT V0.0.1.docx
+++ b/PropuestaProyecto/entregable capitulo1 17 SEPT V0.0.1.docx
@@ -13,8 +13,8 @@
           <w:lang w:val="es-MX"/>
         </w:rPr>
       </w:pPr>
-      <w:bookmarkStart w:id="0" w:name="_Toc208346825"/>
-      <w:bookmarkStart w:id="1" w:name="_Toc208346823"/>
+      <w:bookmarkStart w:id="0" w:name="_Toc208346823"/>
+      <w:bookmarkStart w:id="1" w:name="_Toc208346825"/>
       <w:r>
         <w:rPr>
           <w:rFonts w:ascii="Arial" w:hAnsi="Arial" w:cs="Arial"/>
@@ -25,7 +25,7 @@
         </w:rPr>
         <w:t>CAPITULO I MARCO CONCEPTUAL</w:t>
       </w:r>
-      <w:bookmarkEnd w:id="1"/>
+      <w:bookmarkEnd w:id="0"/>
       <w:r>
         <w:rPr>
           <w:rFonts w:ascii="Arial" w:hAnsi="Arial" w:cs="Arial"/>
@@ -40,7 +40,6 @@
     <w:p>
       <w:pPr>
         <w:pStyle w:val="Ttulo2"/>
-        <w:ind w:left="720"/>
         <w:rPr>
           <w:rFonts w:ascii="Arial" w:hAnsi="Arial" w:cs="Arial"/>
           <w:color w:val="auto"/>
@@ -58,9 +57,1029 @@
           <w:szCs w:val="28"/>
           <w:lang w:val="es-MX"/>
         </w:rPr>
-        <w:t xml:space="preserve">1.1 </w:t>
-      </w:r>
-      <w:r>
+        <w:t>1.1 Estado del arte</w:t>
+      </w:r>
+      <w:bookmarkEnd w:id="2"/>
+    </w:p>
+    <w:p>
+      <w:pPr>
+        <w:rPr>
+          <w:lang w:val="es-MX"/>
+        </w:rPr>
+      </w:pPr>
+      <w:r>
+        <w:t>Consultorio.me</w:t>
+      </w:r>
+      <w:r>
+        <w:br/>
+      </w:r>
+      <w:r>
+        <w:rPr>
+          <w:lang w:val="es-MX"/>
+        </w:rPr>
+        <w:t xml:space="preserve">1. Características </w:t>
+      </w:r>
+      <w:proofErr w:type="spellStart"/>
+      <w:r>
+        <w:rPr>
+          <w:lang w:val="es-MX"/>
+        </w:rPr>
+        <w:t>Consultorio.me</w:t>
+      </w:r>
+      <w:proofErr w:type="spellEnd"/>
+      <w:r>
+        <w:rPr>
+          <w:lang w:val="es-MX"/>
+        </w:rPr>
+        <w:t xml:space="preserve"> es una plataforma digital multiplataforma (web, Android e iOS) orientada a la gestión de consultorios y clínicas. Sus principales características incluyen una agenda online para programar citas con recordatorios automáticos vía WhatsApp, SMS o correo electrónico; expedientes clínicos electrónicos para registrar y organizar la información de los pacientes; y un módulo de control financiero para registrar ingresos, gastos y generar reportes. La aplicación ofrece acceso seguro desde cualquier dispositivo y permite la colaboración con diferentes usuarios. Además, en la versión premium, incluye funciones avanzadas como </w:t>
+      </w:r>
+      <w:proofErr w:type="spellStart"/>
+      <w:r>
+        <w:rPr>
+          <w:lang w:val="es-MX"/>
+        </w:rPr>
+        <w:t>teleconsulta</w:t>
+      </w:r>
+      <w:proofErr w:type="spellEnd"/>
+      <w:r>
+        <w:rPr>
+          <w:lang w:val="es-MX"/>
+        </w:rPr>
+        <w:t xml:space="preserve"> mediante videollamada, </w:t>
+      </w:r>
+      <w:proofErr w:type="spellStart"/>
+      <w:r>
+        <w:rPr>
+          <w:lang w:val="es-MX"/>
+        </w:rPr>
+        <w:t>autoprogramación</w:t>
+      </w:r>
+      <w:proofErr w:type="spellEnd"/>
+      <w:r>
+        <w:rPr>
+          <w:lang w:val="es-MX"/>
+        </w:rPr>
+        <w:t xml:space="preserve"> de citas por parte del paciente a través de un enlace o página pública, formularios personalizados de anamnesis, almacenamiento de archivos en la nube con integración a Google Drive, sincronización con Google Calendar y configuración de múltiples usuarios con diferentes permisos. </w:t>
+      </w:r>
+    </w:p>
+    <w:p>
+      <w:pPr>
+        <w:rPr>
+          <w:lang w:val="es-MX"/>
+        </w:rPr>
+      </w:pPr>
+      <w:r>
+        <w:rPr>
+          <w:lang w:val="es-MX"/>
+        </w:rPr>
+        <w:t xml:space="preserve">2. Ventajas Una de las principales ventajas es que cuenta con una versión gratuita bastante completa, sin límite de pacientes ni citas, lo cual la hace accesible para profesionales independientes o consultorios pequeños. Su interfaz es intuitiva y fácil de usar, reduciendo la curva de aprendizaje. El envío automático de recordatorios reduce significativamente el ausentismo de los pacientes y mejora la organización del consultorio. Además, el hecho de estar disponible en distintas plataformas permite al profesional consultar y gestionar su agenda desde cualquier lugar. Otro beneficio es la telemedicina integrada, que resulta muy útil en contextos donde el paciente no puede acudir físicamente. También destaca su flexibilidad para distintos profesionales de la salud (médicos, dentistas, psicólogos, fisioterapeutas, etc.), y su compatibilidad con Google Calendar mejora la sincronización de agendas personales y profesionales. </w:t>
+      </w:r>
+    </w:p>
+    <w:p>
+      <w:pPr>
+        <w:rPr>
+          <w:lang w:val="es-MX"/>
+        </w:rPr>
+      </w:pPr>
+      <w:r>
+        <w:rPr>
+          <w:lang w:val="es-MX"/>
+        </w:rPr>
+        <w:t xml:space="preserve">3. Desventajas o limitaciones Aunque la versión gratuita es funcional, ciertas herramientas clave solo están disponibles en la versión premium, como la </w:t>
+      </w:r>
+      <w:proofErr w:type="spellStart"/>
+      <w:r>
+        <w:rPr>
+          <w:lang w:val="es-MX"/>
+        </w:rPr>
+        <w:t>teleconsulta</w:t>
+      </w:r>
+      <w:proofErr w:type="spellEnd"/>
+      <w:r>
+        <w:rPr>
+          <w:lang w:val="es-MX"/>
+        </w:rPr>
+        <w:t xml:space="preserve">, </w:t>
+      </w:r>
+      <w:r>
+        <w:rPr>
+          <w:lang w:val="es-MX"/>
+        </w:rPr>
+        <w:lastRenderedPageBreak/>
+        <w:t xml:space="preserve">la </w:t>
+      </w:r>
+      <w:proofErr w:type="spellStart"/>
+      <w:r>
+        <w:rPr>
+          <w:lang w:val="es-MX"/>
+        </w:rPr>
+        <w:t>autoprogramación</w:t>
+      </w:r>
+      <w:proofErr w:type="spellEnd"/>
+      <w:r>
+        <w:rPr>
+          <w:lang w:val="es-MX"/>
+        </w:rPr>
+        <w:t xml:space="preserve"> de citas por parte de los pacientes y los formularios personalizados. Algunos usuarios reportan que la aplicación puede presentar ralentizaciones o errores en actualizaciones recientes, especialmente en dispositivos iOS. Otra limitación es que, aunque es muy versátil, no ofrece módulos especializados para todas las ramas médicas (por ejemplo, odontogramas avanzados para odontología). Asimismo, no es un software certificado oficialmente como expediente clínico electrónico en todos los países, lo cual puede ser una desventaja en lugares con normativas muy estrictas en protección de datos o historia clínica. Finalmente, al depender de internet para la mayoría de sus funciones, no es totalmente funcional en contextos con mala conectividad. </w:t>
+      </w:r>
+    </w:p>
+    <w:p>
+      <w:pPr>
+        <w:rPr>
+          <w:lang w:val="es-MX"/>
+        </w:rPr>
+      </w:pPr>
+      <w:r>
+        <w:rPr>
+          <w:lang w:val="es-MX"/>
+        </w:rPr>
+        <w:t xml:space="preserve">4. Costo / Licencias </w:t>
+      </w:r>
+      <w:proofErr w:type="spellStart"/>
+      <w:r>
+        <w:rPr>
+          <w:lang w:val="es-MX"/>
+        </w:rPr>
+        <w:t>Consultorio.me</w:t>
+      </w:r>
+      <w:proofErr w:type="spellEnd"/>
+      <w:r>
+        <w:rPr>
+          <w:lang w:val="es-MX"/>
+        </w:rPr>
+        <w:t xml:space="preserve"> cuenta con un modelo </w:t>
+      </w:r>
+      <w:proofErr w:type="spellStart"/>
+      <w:r>
+        <w:rPr>
+          <w:lang w:val="es-MX"/>
+        </w:rPr>
+        <w:t>freemium</w:t>
+      </w:r>
+      <w:proofErr w:type="spellEnd"/>
+      <w:r>
+        <w:rPr>
+          <w:lang w:val="es-MX"/>
+        </w:rPr>
+        <w:t xml:space="preserve">: la versión gratuita ofrece agenda, gestión de pacientes, recordatorios y control financiero sin limitaciones de tiempo ni de número de pacientes. La versión Premium requiere una suscripción mensual o anual, cuyo costo depende del país y las funciones seleccionadas. Incluye </w:t>
+      </w:r>
+      <w:proofErr w:type="spellStart"/>
+      <w:r>
+        <w:rPr>
+          <w:lang w:val="es-MX"/>
+        </w:rPr>
+        <w:t>teleconsultas</w:t>
+      </w:r>
+      <w:proofErr w:type="spellEnd"/>
+      <w:r>
+        <w:rPr>
+          <w:lang w:val="es-MX"/>
+        </w:rPr>
+        <w:t xml:space="preserve">, </w:t>
+      </w:r>
+      <w:proofErr w:type="spellStart"/>
+      <w:r>
+        <w:rPr>
+          <w:lang w:val="es-MX"/>
+        </w:rPr>
+        <w:t>autoprogramación</w:t>
+      </w:r>
+      <w:proofErr w:type="spellEnd"/>
+      <w:r>
+        <w:rPr>
+          <w:lang w:val="es-MX"/>
+        </w:rPr>
+        <w:t xml:space="preserve">, usuarios múltiples, formularios personalizados, confirmaciones automáticas de citas y mayor capacidad de almacenamiento. Según reseñas recientes, el precio es competitivo en comparación con otros softwares médicos, ya que su plan premium parte aproximadamente desde 10 a 15 USD mensuales por profesional (aunque puede variar). No requiere instalación de servidores ni licencias perpetuas, ya que funciona bajo el modelo de software como servicio (SaaS). </w:t>
+      </w:r>
+    </w:p>
+    <w:p>
+      <w:pPr>
+        <w:rPr>
+          <w:lang w:val="es-MX"/>
+        </w:rPr>
+      </w:pPr>
+    </w:p>
+    <w:p>
+      <w:pPr>
+        <w:rPr>
+          <w:lang w:val="es-MX"/>
+        </w:rPr>
+      </w:pPr>
+    </w:p>
+    <w:p>
+      <w:pPr>
+        <w:rPr>
+          <w:lang w:val="es-MX"/>
+        </w:rPr>
+      </w:pPr>
+      <w:r>
+        <w:rPr>
+          <w:lang w:val="es-MX"/>
+        </w:rPr>
+        <w:t xml:space="preserve">Referencias APA </w:t>
+      </w:r>
+    </w:p>
+    <w:p>
+      <w:pPr>
+        <w:rPr>
+          <w:lang w:val="es-MX"/>
+        </w:rPr>
+      </w:pPr>
+      <w:r>
+        <w:rPr>
+          <w:lang w:val="es-MX"/>
+        </w:rPr>
+        <w:t xml:space="preserve">Sitio web oficial (versión en español) </w:t>
+      </w:r>
+    </w:p>
+    <w:p>
+      <w:pPr>
+        <w:rPr>
+          <w:lang w:val="es-MX"/>
+        </w:rPr>
+      </w:pPr>
+      <w:proofErr w:type="spellStart"/>
+      <w:r>
+        <w:rPr>
+          <w:lang w:val="es-MX"/>
+        </w:rPr>
+        <w:t>Codequest</w:t>
+      </w:r>
+      <w:proofErr w:type="spellEnd"/>
+      <w:r>
+        <w:rPr>
+          <w:lang w:val="es-MX"/>
+        </w:rPr>
+        <w:t xml:space="preserve"> </w:t>
+      </w:r>
+      <w:proofErr w:type="spellStart"/>
+      <w:r>
+        <w:rPr>
+          <w:lang w:val="es-MX"/>
+        </w:rPr>
+        <w:t>Tecnologia</w:t>
+      </w:r>
+      <w:proofErr w:type="spellEnd"/>
+      <w:r>
+        <w:rPr>
+          <w:lang w:val="es-MX"/>
+        </w:rPr>
+        <w:t xml:space="preserve"> da </w:t>
+      </w:r>
+      <w:proofErr w:type="spellStart"/>
+      <w:r>
+        <w:rPr>
+          <w:lang w:val="es-MX"/>
+        </w:rPr>
+        <w:t>Informação</w:t>
+      </w:r>
+      <w:proofErr w:type="spellEnd"/>
+      <w:r>
+        <w:rPr>
+          <w:lang w:val="es-MX"/>
+        </w:rPr>
+        <w:t xml:space="preserve"> Ltda. (s. f.). La aplicación ideal para profesionales de la salud – </w:t>
+      </w:r>
+      <w:proofErr w:type="spellStart"/>
+      <w:r>
+        <w:rPr>
+          <w:lang w:val="es-MX"/>
+        </w:rPr>
+        <w:t>Consultorio.me</w:t>
+      </w:r>
+      <w:proofErr w:type="spellEnd"/>
+      <w:r>
+        <w:rPr>
+          <w:lang w:val="es-MX"/>
+        </w:rPr>
+        <w:t xml:space="preserve">. Recuperado de la página oficial de </w:t>
+      </w:r>
+      <w:proofErr w:type="spellStart"/>
+      <w:r>
+        <w:rPr>
+          <w:lang w:val="es-MX"/>
+        </w:rPr>
+        <w:t>Consultorio.me</w:t>
+      </w:r>
+      <w:proofErr w:type="spellEnd"/>
+      <w:r>
+        <w:rPr>
+          <w:lang w:val="es-MX"/>
+        </w:rPr>
+        <w:t>. Informe sobre funcionalidades como agenda en línea con recordatorios por WhatsApp, registros clínicos, control financiero, gestión de pacientes, versión gratuita y versión Premium, y reseñas de usuarios.</w:t>
+      </w:r>
+    </w:p>
+    <w:p>
+      <w:pPr>
+        <w:rPr>
+          <w:lang w:val="es-MX"/>
+        </w:rPr>
+      </w:pPr>
+      <w:r>
+        <w:rPr>
+          <w:lang w:val="es-MX"/>
+        </w:rPr>
+        <w:lastRenderedPageBreak/>
+        <w:t xml:space="preserve">Consultorio </w:t>
+      </w:r>
+    </w:p>
+    <w:p>
+      <w:pPr>
+        <w:rPr>
+          <w:lang w:val="es-MX"/>
+        </w:rPr>
+      </w:pPr>
+      <w:r>
+        <w:rPr>
+          <w:lang w:val="es-MX"/>
+        </w:rPr>
+        <w:t xml:space="preserve">Página en Google Play (Android) </w:t>
+      </w:r>
+      <w:proofErr w:type="spellStart"/>
+      <w:r>
+        <w:rPr>
+          <w:lang w:val="es-MX"/>
+        </w:rPr>
+        <w:t>Codequest</w:t>
+      </w:r>
+      <w:proofErr w:type="spellEnd"/>
+      <w:r>
+        <w:rPr>
+          <w:lang w:val="es-MX"/>
+        </w:rPr>
+        <w:t xml:space="preserve"> Software. (2024, 4 de octubre). Consultorio (</w:t>
+      </w:r>
+      <w:proofErr w:type="spellStart"/>
+      <w:r>
+        <w:rPr>
+          <w:lang w:val="es-MX"/>
+        </w:rPr>
+        <w:t>Consultorio.me</w:t>
+      </w:r>
+      <w:proofErr w:type="spellEnd"/>
+      <w:r>
+        <w:rPr>
+          <w:lang w:val="es-MX"/>
+        </w:rPr>
+        <w:t xml:space="preserve">) [Aplicación]. Google Play. Recuperado de Google Play. Contiene descripción de la aplicación, características como historias clínicas, recordatorios, gestión financiera, puntuación promedio (4.1 con 2.65 K opiniones), y fecha de actualización. </w:t>
+      </w:r>
+    </w:p>
+    <w:p>
+      <w:pPr>
+        <w:rPr>
+          <w:lang w:val="es-MX"/>
+        </w:rPr>
+      </w:pPr>
+      <w:r>
+        <w:rPr>
+          <w:lang w:val="es-MX"/>
+        </w:rPr>
+        <w:t xml:space="preserve">Google Play </w:t>
+      </w:r>
+    </w:p>
+    <w:p>
+      <w:pPr>
+        <w:rPr>
+          <w:lang w:val="es-MX"/>
+        </w:rPr>
+      </w:pPr>
+      <w:r>
+        <w:rPr>
+          <w:lang w:val="es-MX"/>
+        </w:rPr>
+        <w:t xml:space="preserve">Página en App Store (versión internacional / Estados Unidos) </w:t>
+      </w:r>
+      <w:proofErr w:type="spellStart"/>
+      <w:r>
+        <w:rPr>
+          <w:lang w:val="es-MX"/>
+        </w:rPr>
+        <w:t>Codequest</w:t>
+      </w:r>
+      <w:proofErr w:type="spellEnd"/>
+      <w:r>
+        <w:rPr>
+          <w:lang w:val="es-MX"/>
+        </w:rPr>
+        <w:t xml:space="preserve"> Software. (s. f.). </w:t>
+      </w:r>
+      <w:proofErr w:type="spellStart"/>
+      <w:r>
+        <w:rPr>
+          <w:lang w:val="es-MX"/>
+        </w:rPr>
+        <w:t>Consultorio.me</w:t>
+      </w:r>
+      <w:proofErr w:type="spellEnd"/>
+      <w:r>
+        <w:rPr>
+          <w:lang w:val="es-MX"/>
+        </w:rPr>
+        <w:t xml:space="preserve">: For </w:t>
+      </w:r>
+      <w:proofErr w:type="spellStart"/>
+      <w:r>
+        <w:rPr>
+          <w:lang w:val="es-MX"/>
+        </w:rPr>
+        <w:t>healthcare</w:t>
+      </w:r>
+      <w:proofErr w:type="spellEnd"/>
+      <w:r>
+        <w:rPr>
+          <w:lang w:val="es-MX"/>
+        </w:rPr>
+        <w:t xml:space="preserve"> </w:t>
+      </w:r>
+      <w:proofErr w:type="spellStart"/>
+      <w:r>
+        <w:rPr>
+          <w:lang w:val="es-MX"/>
+        </w:rPr>
+        <w:t>professionals</w:t>
+      </w:r>
+      <w:proofErr w:type="spellEnd"/>
+      <w:r>
+        <w:rPr>
+          <w:lang w:val="es-MX"/>
+        </w:rPr>
+        <w:t xml:space="preserve"> [Aplicación para iOS]. App Store (Estados Unidos). Recuperado de App Store. Destaca funciones como programación de citas, registros electrónicos, telemedicina, soporte </w:t>
+      </w:r>
+      <w:proofErr w:type="spellStart"/>
+      <w:r>
+        <w:rPr>
+          <w:lang w:val="es-MX"/>
+        </w:rPr>
+        <w:t>multi-especialidad</w:t>
+      </w:r>
+      <w:proofErr w:type="spellEnd"/>
+      <w:r>
+        <w:rPr>
+          <w:lang w:val="es-MX"/>
+        </w:rPr>
+        <w:t>, sin límites en versión gratuita e integración web.</w:t>
+      </w:r>
+    </w:p>
+    <w:p>
+      <w:pPr>
+        <w:rPr>
+          <w:lang w:val="es-MX"/>
+        </w:rPr>
+      </w:pPr>
+    </w:p>
+    <w:p>
+      <w:pPr>
+        <w:rPr>
+          <w:lang w:val="es-MX"/>
+        </w:rPr>
+      </w:pPr>
+    </w:p>
+    <w:p>
+      <w:pPr>
+        <w:rPr>
+          <w:lang w:val="es-MX"/>
+        </w:rPr>
+      </w:pPr>
+    </w:p>
+    <w:p>
+      <w:pPr>
+        <w:rPr>
+          <w:lang w:val="es-MX"/>
+        </w:rPr>
+      </w:pPr>
+    </w:p>
+    <w:p>
+      <w:pPr>
+        <w:rPr>
+          <w:lang w:val="es-MX"/>
+        </w:rPr>
+      </w:pPr>
+    </w:p>
+    <w:p>
+      <w:pPr>
+        <w:rPr>
+          <w:lang w:val="es-MX"/>
+        </w:rPr>
+      </w:pPr>
+    </w:p>
+    <w:p>
+      <w:pPr>
+        <w:rPr>
+          <w:lang w:val="es-MX"/>
+        </w:rPr>
+      </w:pPr>
+    </w:p>
+    <w:p>
+      <w:pPr>
+        <w:rPr>
+          <w:lang w:val="es-MX"/>
+        </w:rPr>
+      </w:pPr>
+    </w:p>
+    <w:p>
+      <w:pPr>
+        <w:rPr>
+          <w:lang w:val="es-MX"/>
+        </w:rPr>
+      </w:pPr>
+    </w:p>
+    <w:p>
+      <w:pPr>
+        <w:rPr>
+          <w:lang w:val="es-MX"/>
+        </w:rPr>
+      </w:pPr>
+    </w:p>
+    <w:p>
+      <w:pPr>
+        <w:rPr>
+          <w:lang w:val="es-MX"/>
+        </w:rPr>
+      </w:pPr>
+    </w:p>
+    <w:p>
+      <w:pPr>
+        <w:rPr>
+          <w:lang w:val="es-MX"/>
+        </w:rPr>
+      </w:pPr>
+    </w:p>
+    <w:p>
+      <w:pPr>
+        <w:rPr>
+          <w:lang w:val="es-MX"/>
+        </w:rPr>
+      </w:pPr>
+    </w:p>
+    <w:p>
+      <w:pPr>
+        <w:rPr>
+          <w:b/>
+          <w:bCs/>
+          <w:lang w:val="es-MX"/>
+        </w:rPr>
+      </w:pPr>
+      <w:r>
+        <w:rPr>
+          <w:b/>
+          <w:bCs/>
+          <w:lang w:val="es-MX"/>
+        </w:rPr>
+        <w:lastRenderedPageBreak/>
+        <w:t>Sonrisas Mexicanas (App / Sitio Web)</w:t>
+      </w:r>
+    </w:p>
+    <w:p>
+      <w:pPr>
+        <w:rPr>
+          <w:lang w:val="es-MX"/>
+        </w:rPr>
+      </w:pPr>
+      <w:r>
+        <w:rPr>
+          <w:lang w:val="es-MX"/>
+        </w:rPr>
+        <w:t xml:space="preserve">La app de Sonrisas Mexicanas permite a los pacientes gestionar citas, consultar estudios y facturas, y comunicarse con asesores. Las características incluyen agendar y reagendar citas, revisar estudios radiográficos, acceder a tickets y facturas, y utilizar un chat para contactar con un asesor para obtener ayuda o información sobre tratamientos como Brackets, </w:t>
+      </w:r>
+      <w:proofErr w:type="spellStart"/>
+      <w:r>
+        <w:rPr>
+          <w:lang w:val="es-MX"/>
+        </w:rPr>
+        <w:t>Myo</w:t>
+      </w:r>
+      <w:proofErr w:type="spellEnd"/>
+      <w:r>
+        <w:rPr>
+          <w:lang w:val="es-MX"/>
+        </w:rPr>
+        <w:t xml:space="preserve"> y Clear.</w:t>
+      </w:r>
+    </w:p>
+    <w:p>
+      <w:pPr>
+        <w:rPr>
+          <w:b/>
+          <w:bCs/>
+        </w:rPr>
+      </w:pPr>
+      <w:proofErr w:type="spellStart"/>
+      <w:r>
+        <w:rPr>
+          <w:b/>
+          <w:bCs/>
+        </w:rPr>
+        <w:t>Características</w:t>
+      </w:r>
+      <w:proofErr w:type="spellEnd"/>
+    </w:p>
+    <w:p>
+      <w:pPr>
+        <w:numPr>
+          <w:ilvl w:val="0"/>
+          <w:numId w:val="44"/>
+        </w:numPr>
+        <w:tabs>
+          <w:tab w:val="clear" w:pos="1080"/>
+          <w:tab w:val="num" w:pos="360"/>
+        </w:tabs>
+        <w:ind w:left="360"/>
+        <w:rPr>
+          <w:lang w:val="es-MX"/>
+        </w:rPr>
+      </w:pPr>
+      <w:r>
+        <w:rPr>
+          <w:lang w:val="es-MX"/>
+        </w:rPr>
+        <w:t>App móvil disponible en iOS y Android.</w:t>
+      </w:r>
+    </w:p>
+    <w:p>
+      <w:pPr>
+        <w:numPr>
+          <w:ilvl w:val="0"/>
+          <w:numId w:val="44"/>
+        </w:numPr>
+        <w:tabs>
+          <w:tab w:val="clear" w:pos="1080"/>
+          <w:tab w:val="num" w:pos="360"/>
+        </w:tabs>
+        <w:ind w:left="360"/>
+        <w:rPr>
+          <w:lang w:val="es-MX"/>
+        </w:rPr>
+      </w:pPr>
+      <w:r>
+        <w:rPr>
+          <w:lang w:val="es-MX"/>
+        </w:rPr>
+        <w:t>Permite agendar y reagendar citas de manera digital.</w:t>
+      </w:r>
+    </w:p>
+    <w:p>
+      <w:pPr>
+        <w:numPr>
+          <w:ilvl w:val="0"/>
+          <w:numId w:val="44"/>
+        </w:numPr>
+        <w:tabs>
+          <w:tab w:val="clear" w:pos="1080"/>
+          <w:tab w:val="num" w:pos="360"/>
+        </w:tabs>
+        <w:ind w:left="360"/>
+        <w:rPr>
+          <w:lang w:val="es-MX"/>
+        </w:rPr>
+      </w:pPr>
+      <w:r>
+        <w:rPr>
+          <w:lang w:val="es-MX"/>
+        </w:rPr>
+        <w:t>Consultar y descargar estudios radiográficos y facturas.</w:t>
+      </w:r>
+    </w:p>
+    <w:p>
+      <w:pPr>
+        <w:numPr>
+          <w:ilvl w:val="0"/>
+          <w:numId w:val="44"/>
+        </w:numPr>
+        <w:tabs>
+          <w:tab w:val="clear" w:pos="1080"/>
+          <w:tab w:val="num" w:pos="360"/>
+        </w:tabs>
+        <w:ind w:left="360"/>
+        <w:rPr>
+          <w:lang w:val="es-MX"/>
+        </w:rPr>
+      </w:pPr>
+      <w:r>
+        <w:rPr>
+          <w:lang w:val="es-MX"/>
+        </w:rPr>
+        <w:t>Comunicación directa con asesores desde la app.</w:t>
+      </w:r>
+    </w:p>
+    <w:p>
+      <w:pPr>
+        <w:numPr>
+          <w:ilvl w:val="0"/>
+          <w:numId w:val="44"/>
+        </w:numPr>
+        <w:tabs>
+          <w:tab w:val="clear" w:pos="1080"/>
+          <w:tab w:val="num" w:pos="360"/>
+        </w:tabs>
+        <w:ind w:left="360"/>
+        <w:rPr>
+          <w:lang w:val="es-MX"/>
+        </w:rPr>
+      </w:pPr>
+      <w:r>
+        <w:rPr>
+          <w:lang w:val="es-MX"/>
+        </w:rPr>
+        <w:t>Interfaz simple, enfocada en la experiencia del usuario.</w:t>
+      </w:r>
+    </w:p>
+    <w:p>
+      <w:pPr>
+        <w:rPr>
+          <w:b/>
+          <w:bCs/>
+        </w:rPr>
+      </w:pPr>
+      <w:proofErr w:type="spellStart"/>
+      <w:r>
+        <w:rPr>
+          <w:b/>
+          <w:bCs/>
+        </w:rPr>
+        <w:t>Ventajas</w:t>
+      </w:r>
+      <w:proofErr w:type="spellEnd"/>
+    </w:p>
+    <w:p>
+      <w:pPr>
+        <w:numPr>
+          <w:ilvl w:val="0"/>
+          <w:numId w:val="45"/>
+        </w:numPr>
+        <w:tabs>
+          <w:tab w:val="clear" w:pos="1080"/>
+          <w:tab w:val="num" w:pos="360"/>
+        </w:tabs>
+        <w:ind w:left="360"/>
+        <w:rPr>
+          <w:lang w:val="es-MX"/>
+        </w:rPr>
+      </w:pPr>
+      <w:r>
+        <w:rPr>
+          <w:lang w:val="es-MX"/>
+        </w:rPr>
+        <w:t>Centraliza la información de los pacientes de manera digital.</w:t>
+      </w:r>
+    </w:p>
+    <w:p>
+      <w:pPr>
+        <w:numPr>
+          <w:ilvl w:val="0"/>
+          <w:numId w:val="45"/>
+        </w:numPr>
+        <w:tabs>
+          <w:tab w:val="clear" w:pos="1080"/>
+          <w:tab w:val="num" w:pos="360"/>
+        </w:tabs>
+        <w:ind w:left="360"/>
+        <w:rPr>
+          <w:lang w:val="es-MX"/>
+        </w:rPr>
+      </w:pPr>
+      <w:r>
+        <w:rPr>
+          <w:lang w:val="es-MX"/>
+        </w:rPr>
+        <w:t>Fácil acceso desde cualquier dispositivo móvil.</w:t>
+      </w:r>
+    </w:p>
+    <w:p>
+      <w:pPr>
+        <w:numPr>
+          <w:ilvl w:val="0"/>
+          <w:numId w:val="45"/>
+        </w:numPr>
+        <w:tabs>
+          <w:tab w:val="clear" w:pos="1080"/>
+          <w:tab w:val="num" w:pos="360"/>
+        </w:tabs>
+        <w:ind w:left="360"/>
+        <w:rPr>
+          <w:lang w:val="es-MX"/>
+        </w:rPr>
+      </w:pPr>
+      <w:r>
+        <w:rPr>
+          <w:lang w:val="es-MX"/>
+        </w:rPr>
+        <w:t>Mejora la experiencia del paciente al reducir llamadas y esperas.</w:t>
+      </w:r>
+    </w:p>
+    <w:p>
+      <w:pPr>
+        <w:rPr>
+          <w:b/>
+          <w:bCs/>
+        </w:rPr>
+      </w:pPr>
+      <w:proofErr w:type="spellStart"/>
+      <w:r>
+        <w:rPr>
+          <w:b/>
+          <w:bCs/>
+        </w:rPr>
+        <w:t>Desventajas</w:t>
+      </w:r>
+      <w:proofErr w:type="spellEnd"/>
+      <w:r>
+        <w:rPr>
+          <w:b/>
+          <w:bCs/>
+        </w:rPr>
+        <w:t xml:space="preserve"> o </w:t>
+      </w:r>
+      <w:proofErr w:type="spellStart"/>
+      <w:r>
+        <w:rPr>
+          <w:b/>
+          <w:bCs/>
+        </w:rPr>
+        <w:t>Limitaciones</w:t>
+      </w:r>
+      <w:proofErr w:type="spellEnd"/>
+    </w:p>
+    <w:p>
+      <w:pPr>
+        <w:numPr>
+          <w:ilvl w:val="0"/>
+          <w:numId w:val="46"/>
+        </w:numPr>
+        <w:tabs>
+          <w:tab w:val="clear" w:pos="1080"/>
+          <w:tab w:val="num" w:pos="360"/>
+        </w:tabs>
+        <w:ind w:left="360"/>
+        <w:rPr>
+          <w:lang w:val="es-MX"/>
+        </w:rPr>
+      </w:pPr>
+      <w:r>
+        <w:rPr>
+          <w:lang w:val="es-MX"/>
+        </w:rPr>
+        <w:t>Solo funciona en dispositivos móviles.</w:t>
+      </w:r>
+    </w:p>
+    <w:p>
+      <w:pPr>
+        <w:numPr>
+          <w:ilvl w:val="0"/>
+          <w:numId w:val="46"/>
+        </w:numPr>
+        <w:tabs>
+          <w:tab w:val="clear" w:pos="1080"/>
+          <w:tab w:val="num" w:pos="360"/>
+        </w:tabs>
+        <w:ind w:left="360"/>
+        <w:rPr>
+          <w:lang w:val="es-MX"/>
+        </w:rPr>
+      </w:pPr>
+      <w:r>
+        <w:rPr>
+          <w:lang w:val="es-MX"/>
+        </w:rPr>
+        <w:t>Algunas funciones requieren conexión a internet.</w:t>
+      </w:r>
+    </w:p>
+    <w:p>
+      <w:pPr>
+        <w:numPr>
+          <w:ilvl w:val="0"/>
+          <w:numId w:val="46"/>
+        </w:numPr>
+        <w:tabs>
+          <w:tab w:val="clear" w:pos="1080"/>
+          <w:tab w:val="num" w:pos="360"/>
+        </w:tabs>
+        <w:ind w:left="360"/>
+        <w:rPr>
+          <w:lang w:val="es-MX"/>
+        </w:rPr>
+      </w:pPr>
+      <w:r>
+        <w:rPr>
+          <w:lang w:val="es-MX"/>
+        </w:rPr>
+        <w:t>No permite funcionalidades avanzadas para clínicas independientes (solo para sucursales oficiales).</w:t>
+      </w:r>
+    </w:p>
+    <w:p>
+      <w:pPr>
+        <w:rPr>
+          <w:b/>
+          <w:bCs/>
+        </w:rPr>
+      </w:pPr>
+      <w:r>
+        <w:rPr>
+          <w:b/>
+          <w:bCs/>
+        </w:rPr>
+        <w:t xml:space="preserve">Costos / </w:t>
+      </w:r>
+      <w:proofErr w:type="spellStart"/>
+      <w:r>
+        <w:rPr>
+          <w:b/>
+          <w:bCs/>
+        </w:rPr>
+        <w:t>Licencias</w:t>
+      </w:r>
+      <w:proofErr w:type="spellEnd"/>
+    </w:p>
+    <w:p>
+      <w:pPr>
+        <w:numPr>
+          <w:ilvl w:val="0"/>
+          <w:numId w:val="47"/>
+        </w:numPr>
+        <w:tabs>
+          <w:tab w:val="clear" w:pos="1080"/>
+          <w:tab w:val="num" w:pos="360"/>
+        </w:tabs>
+        <w:ind w:left="360"/>
+        <w:rPr>
+          <w:lang w:val="es-MX"/>
+        </w:rPr>
+      </w:pPr>
+      <w:r>
+        <w:rPr>
+          <w:lang w:val="es-MX"/>
+        </w:rPr>
+        <w:t>La app es gratuita</w:t>
+      </w:r>
+      <w:r>
+        <w:rPr>
+          <w:b/>
+          <w:bCs/>
+          <w:lang w:val="es-MX"/>
+        </w:rPr>
+        <w:t xml:space="preserve"> </w:t>
+      </w:r>
+      <w:r>
+        <w:rPr>
+          <w:lang w:val="es-MX"/>
+        </w:rPr>
+        <w:t>para los pacientes.</w:t>
+      </w:r>
+    </w:p>
+    <w:p>
+      <w:pPr>
+        <w:numPr>
+          <w:ilvl w:val="0"/>
+          <w:numId w:val="47"/>
+        </w:numPr>
+        <w:tabs>
+          <w:tab w:val="clear" w:pos="1080"/>
+          <w:tab w:val="num" w:pos="360"/>
+        </w:tabs>
+        <w:ind w:left="360"/>
+        <w:rPr>
+          <w:lang w:val="es-MX"/>
+        </w:rPr>
+      </w:pPr>
+      <w:r>
+        <w:rPr>
+          <w:lang w:val="es-MX"/>
+        </w:rPr>
+        <w:t>No requiere licencia adicional para usarla.</w:t>
+      </w:r>
+    </w:p>
+    <w:p>
+      <w:pPr>
+        <w:numPr>
+          <w:ilvl w:val="0"/>
+          <w:numId w:val="47"/>
+        </w:numPr>
+        <w:tabs>
+          <w:tab w:val="clear" w:pos="1080"/>
+          <w:tab w:val="num" w:pos="360"/>
+        </w:tabs>
+        <w:ind w:left="360"/>
+        <w:rPr>
+          <w:lang w:val="es-MX"/>
+        </w:rPr>
+      </w:pPr>
+      <w:r>
+        <w:rPr>
+          <w:lang w:val="es-MX"/>
+        </w:rPr>
+        <w:lastRenderedPageBreak/>
+        <w:t>Servicios dentales asociados a la app tienen costos de tratamientos, no de la app en sí.</w:t>
+      </w:r>
+    </w:p>
+    <w:p>
+      <w:pPr>
+        <w:rPr>
+          <w:lang w:val="es-MX"/>
+        </w:rPr>
+      </w:pPr>
+    </w:p>
+    <w:p>
+      <w:pPr>
+        <w:pStyle w:val="Ttulo2"/>
         <w:rPr>
           <w:rFonts w:ascii="Arial" w:hAnsi="Arial" w:cs="Arial"/>
           <w:color w:val="auto"/>
@@ -68,27 +1087,8 @@
           <w:szCs w:val="28"/>
           <w:lang w:val="es-MX"/>
         </w:rPr>
-        <w:t>Estado del arte</w:t>
-      </w:r>
-      <w:bookmarkEnd w:id="2"/>
-    </w:p>
-    <w:p>
-      <w:pPr>
-        <w:rPr>
-          <w:lang w:val="es-MX"/>
-        </w:rPr>
-      </w:pPr>
-      <w:r>
-        <w:rPr>
-          <w:lang w:val="es-MX"/>
-        </w:rPr>
-        <w:tab/>
-      </w:r>
-    </w:p>
-    <w:p>
-      <w:pPr>
-        <w:pStyle w:val="Ttulo2"/>
-        <w:ind w:left="720"/>
+      </w:pPr>
+      <w:r>
         <w:rPr>
           <w:rFonts w:ascii="Arial" w:hAnsi="Arial" w:cs="Arial"/>
           <w:color w:val="auto"/>
@@ -96,84 +1096,130 @@
           <w:szCs w:val="28"/>
           <w:lang w:val="es-MX"/>
         </w:rPr>
-      </w:pPr>
-      <w:r>
-        <w:rPr>
-          <w:rFonts w:ascii="Arial" w:hAnsi="Arial" w:cs="Arial"/>
-          <w:color w:val="auto"/>
-          <w:sz w:val="28"/>
-          <w:szCs w:val="28"/>
-        </w:rPr>
-        <w:t xml:space="preserve">1.2 </w:t>
+        <w:t>1.2 Definición del problema</w:t>
+      </w:r>
+      <w:bookmarkEnd w:id="1"/>
+    </w:p>
+    <w:p>
+      <w:pPr>
+        <w:rPr>
+          <w:rFonts w:cs="Arial"/>
+          <w:lang w:val="es-MX"/>
+        </w:rPr>
+      </w:pPr>
+      <w:r>
+        <w:rPr>
+          <w:rFonts w:cs="Arial"/>
+          <w:lang w:val="es-MX"/>
+        </w:rPr>
+        <w:t>¿Cuáles son los factores que influyen en la eficiencia y organización de la gestión de citas en el consultorio dental Cali-</w:t>
       </w:r>
       <w:proofErr w:type="spellStart"/>
       <w:r>
         <w:rPr>
-          <w:rFonts w:ascii="Arial" w:hAnsi="Arial" w:cs="Arial"/>
-          <w:color w:val="auto"/>
-          <w:sz w:val="28"/>
-          <w:szCs w:val="28"/>
-        </w:rPr>
-        <w:t>Definición</w:t>
+          <w:rFonts w:cs="Arial"/>
+          <w:lang w:val="es-MX"/>
+        </w:rPr>
+        <w:t>Dent</w:t>
       </w:r>
       <w:proofErr w:type="spellEnd"/>
       <w:r>
         <w:rPr>
-          <w:rFonts w:ascii="Arial" w:hAnsi="Arial" w:cs="Arial"/>
-          <w:color w:val="auto"/>
-          <w:sz w:val="28"/>
-          <w:szCs w:val="28"/>
-        </w:rPr>
-        <w:t xml:space="preserve"> del </w:t>
+          <w:rFonts w:cs="Arial"/>
+          <w:lang w:val="es-MX"/>
+        </w:rPr>
+        <w:t>, teniendo en cuenta la interacción entre pacientes, dentista y asistente, así como los métodos actuales de registro en agenda manual o calendario digital?</w:t>
+      </w:r>
+    </w:p>
+    <w:p>
+      <w:pPr>
+        <w:pStyle w:val="Prrafodelista"/>
+        <w:ind w:left="0"/>
+        <w:rPr>
+          <w:rFonts w:cs="Arial"/>
+          <w:lang w:val="es-MX"/>
+        </w:rPr>
+      </w:pPr>
+      <w:r>
+        <w:rPr>
+          <w:rFonts w:cs="Arial"/>
+          <w:lang w:val="es-MX"/>
+        </w:rPr>
+        <w:t>En el consultorio dental Cali-</w:t>
       </w:r>
       <w:proofErr w:type="spellStart"/>
       <w:r>
         <w:rPr>
-          <w:rFonts w:ascii="Arial" w:hAnsi="Arial" w:cs="Arial"/>
-          <w:color w:val="auto"/>
-          <w:sz w:val="28"/>
-          <w:szCs w:val="28"/>
-        </w:rPr>
-        <w:t>problema</w:t>
-      </w:r>
-      <w:bookmarkEnd w:id="0"/>
+          <w:rFonts w:cs="Arial"/>
+          <w:lang w:val="es-MX"/>
+        </w:rPr>
+        <w:t>Dent</w:t>
+      </w:r>
       <w:proofErr w:type="spellEnd"/>
-    </w:p>
-    <w:p>
-      <w:pPr>
-        <w:ind w:left="708"/>
+      <w:r>
         <w:rPr>
           <w:rFonts w:cs="Arial"/>
           <w:lang w:val="es-MX"/>
         </w:rPr>
-      </w:pPr>
-      <w:r>
+        <w:t xml:space="preserve"> se han identificado diversas maneras de agendar citas entre los roles de paciente, doctor y asistente dental. No obstante, se ha observado una deficiencia recurrente en la gestión de este proceso, lo que provoca dificultades en la organización y atención adecuada de los pacientes.</w:t>
+      </w:r>
+    </w:p>
+    <w:p>
+      <w:pPr>
+        <w:pStyle w:val="Prrafodelista"/>
+        <w:ind w:left="0"/>
         <w:rPr>
           <w:rFonts w:cs="Arial"/>
           <w:lang w:val="es-MX"/>
         </w:rPr>
-        <w:t>¿Cuáles son los factores que influyen en la eficiencia y organización de la gestión de citas en el consultorio dental Cali-</w:t>
-      </w:r>
-      <w:proofErr w:type="spellStart"/>
+      </w:pPr>
       <w:r>
         <w:rPr>
           <w:rFonts w:cs="Arial"/>
           <w:lang w:val="es-MX"/>
         </w:rPr>
-        <w:t>Dent</w:t>
-      </w:r>
-      <w:proofErr w:type="spellEnd"/>
+        <w:t xml:space="preserve">El Dr. Ricardo Segura Valdés, cirujano dentista, señala que a lo largo de la trayectoria del consultorio se han presentado diversos casos relacionados con la gestión de citas. Estos casos han evidenciado que, en muchas ocasiones, el uso de la agenda manual genera desorden visual y dificultades en la organización, lo que afecta la eficiencia en la programación y seguimiento de las citas. </w:t>
+      </w:r>
+    </w:p>
+    <w:p>
+      <w:pPr>
+        <w:pStyle w:val="Prrafodelista"/>
+        <w:ind w:left="0"/>
+        <w:rPr>
+          <w:lang w:val="es-MX"/>
+        </w:rPr>
+      </w:pPr>
       <w:r>
         <w:rPr>
           <w:rFonts w:cs="Arial"/>
           <w:lang w:val="es-MX"/>
         </w:rPr>
-        <w:t>, teniendo en cuenta la interacción entre pacientes, dentista y asistente, así como los métodos actuales de registro en agenda manual o calendario digital?</w:t>
+        <w:t>La primera situación ocurre cuando un paciente llega al consultorio sin cita previa, es decir, en su primera visita. En estos casos, con frecuencia no recibe atención inmediata en la sala de espera, ya que el dentista se encuentra ocupado con otro paciente y el asistente está apoyando en el procedimiento. Ante ello, el paciente debe esperar su turno o acudir a tocar la puerta para ser atendido.</w:t>
+      </w:r>
+      <w:r>
+        <w:rPr>
+          <w:lang w:val="es-MX"/>
+        </w:rPr>
+        <w:t xml:space="preserve"> </w:t>
+      </w:r>
+      <w:r>
+        <w:rPr>
+          <w:rFonts w:cs="Arial"/>
+          <w:lang w:val="es-MX"/>
+        </w:rPr>
+        <w:t>La segunda situación ocurre cuando el paciente ya es cliente del consultorio. En este caso, la cita se agenda directamente en el establecimiento, confirmando con el paciente el día y la hora de su disponibilidad. El registro se realiza principalmente en una agenda manual o, en su defecto, en el calendario del teléfono. En caso de que el paciente requiera cancelar o reprogramar, se le facilita el número del consultorio para que pueda gestionar su solicitud mediante una llamada telefónica o un mensaje de WhatsApp.</w:t>
+      </w:r>
+      <w:r>
+        <w:rPr>
+          <w:lang w:val="es-MX"/>
+        </w:rPr>
+        <w:t xml:space="preserve"> </w:t>
       </w:r>
     </w:p>
     <w:p>
       <w:pPr>
         <w:pStyle w:val="Prrafodelista"/>
+        <w:ind w:left="0"/>
         <w:rPr>
           <w:rFonts w:cs="Arial"/>
           <w:lang w:val="es-MX"/>
@@ -184,130 +1230,44 @@
           <w:rFonts w:cs="Arial"/>
           <w:lang w:val="es-MX"/>
         </w:rPr>
-        <w:t>En el consultorio dental Cali-</w:t>
-      </w:r>
-      <w:proofErr w:type="spellStart"/>
-      <w:r>
+        <w:lastRenderedPageBreak/>
+        <w:t>La tercera situación, similar a la primera pero de manera remota, se presenta cuando el paciente es nuevo y no está familiarizado con el consultorio. En este caso, el paciente se informa sobre los servicios ofrecidos a través de redes sociales, guarda el número del consultorio y posteriormente realiza una llamada o envía un mensaje para solicitar información adicional. Tras consultar sobre los servicios y costos, solicita una cita, la cual, en la mayoría de los casos, es agendada directamente por el dentista, asegurando así la atención adecuada desde el primer contacto.</w:t>
+      </w:r>
+    </w:p>
+    <w:p>
+      <w:pPr>
+        <w:pStyle w:val="Prrafodelista"/>
+        <w:ind w:left="0"/>
         <w:rPr>
           <w:rFonts w:cs="Arial"/>
           <w:lang w:val="es-MX"/>
         </w:rPr>
-        <w:t>Dent</w:t>
-      </w:r>
-      <w:proofErr w:type="spellEnd"/>
+      </w:pPr>
       <w:r>
         <w:rPr>
           <w:rFonts w:cs="Arial"/>
           <w:lang w:val="es-MX"/>
         </w:rPr>
-        <w:t xml:space="preserve"> se han identificado diversas maneras de agendar citas entre los roles de paciente, doctor y asistente dental. No obstante, se ha observado una deficiencia recurrente en la gestión de este proceso, lo que provoca dificultades en la organización y atención adecuada de los pacientes.</w:t>
-      </w:r>
-    </w:p>
-    <w:p>
-      <w:pPr>
-        <w:pStyle w:val="Prrafodelista"/>
-        <w:rPr>
-          <w:rFonts w:cs="Arial"/>
-          <w:lang w:val="es-MX"/>
-        </w:rPr>
-      </w:pPr>
-      <w:r>
-        <w:rPr>
-          <w:rFonts w:cs="Arial"/>
-          <w:lang w:val="es-MX"/>
-        </w:rPr>
-        <w:t xml:space="preserve">El Dr. Ricardo Segura Valdés, cirujano dentista, señala que a lo largo de la trayectoria del consultorio se han presentado diversos casos relacionados con la gestión de citas. Estos casos han evidenciado que, en muchas ocasiones, el uso de la agenda manual genera desorden visual y dificultades en la organización, lo que afecta la eficiencia en la programación y seguimiento de las citas. </w:t>
-      </w:r>
-    </w:p>
-    <w:p>
-      <w:pPr>
-        <w:pStyle w:val="Prrafodelista"/>
-        <w:rPr>
-          <w:lang w:val="es-MX"/>
-        </w:rPr>
-      </w:pPr>
-      <w:r>
-        <w:rPr>
-          <w:rFonts w:cs="Arial"/>
-          <w:lang w:val="es-MX"/>
-        </w:rPr>
-        <w:t>La primera situación ocurre cuando un paciente llega al consultorio sin cita previa, es decir, en su primera visita. En estos casos, con frecuencia no recibe atención inmediata en la sala de espera, ya que el dentista se encuentra ocupado con otro paciente y el asistente está apoyando en el procedimiento. Ante ello, el paciente debe esperar su turno o acudir a tocar la puerta para ser atendido.</w:t>
-      </w:r>
-      <w:r>
-        <w:rPr>
-          <w:lang w:val="es-MX"/>
-        </w:rPr>
-        <w:t xml:space="preserve"> </w:t>
-      </w:r>
-      <w:r>
-        <w:rPr>
-          <w:rFonts w:cs="Arial"/>
-          <w:lang w:val="es-MX"/>
-        </w:rPr>
-        <w:t xml:space="preserve">La segunda situación ocurre cuando el paciente ya es cliente del consultorio. En este caso, la cita se agenda directamente en el establecimiento, confirmando con el paciente el día y la hora de su disponibilidad. El registro se realiza principalmente en una agenda manual o, en su defecto, en el calendario del teléfono. En caso de que el paciente requiera cancelar o reprogramar, se le facilita el número del consultorio </w:t>
-      </w:r>
-      <w:r>
-        <w:rPr>
-          <w:rFonts w:cs="Arial"/>
-          <w:lang w:val="es-MX"/>
-        </w:rPr>
-        <w:lastRenderedPageBreak/>
-        <w:t>para que pueda gestionar su solicitud mediante una llamada telefónica o un mensaje de WhatsApp.</w:t>
-      </w:r>
-      <w:r>
-        <w:rPr>
-          <w:lang w:val="es-MX"/>
-        </w:rPr>
-        <w:t xml:space="preserve"> </w:t>
-      </w:r>
-    </w:p>
-    <w:p>
-      <w:pPr>
-        <w:pStyle w:val="Prrafodelista"/>
-        <w:rPr>
-          <w:rFonts w:cs="Arial"/>
-          <w:lang w:val="es-MX"/>
-        </w:rPr>
-      </w:pPr>
-      <w:r>
-        <w:rPr>
-          <w:rFonts w:cs="Arial"/>
-          <w:lang w:val="es-MX"/>
-        </w:rPr>
-        <w:t xml:space="preserve">La tercera situación, similar a la </w:t>
-      </w:r>
-      <w:proofErr w:type="gramStart"/>
-      <w:r>
-        <w:rPr>
-          <w:rFonts w:cs="Arial"/>
-          <w:lang w:val="es-MX"/>
-        </w:rPr>
-        <w:t>primera</w:t>
-      </w:r>
-      <w:proofErr w:type="gramEnd"/>
-      <w:r>
-        <w:rPr>
-          <w:rFonts w:cs="Arial"/>
-          <w:lang w:val="es-MX"/>
-        </w:rPr>
-        <w:t xml:space="preserve"> pero de manera remota, se presenta cuando el paciente es nuevo y no está familiarizado con el consultorio. En este caso, el paciente se informa sobre los servicios ofrecidos a través de redes sociales, guarda el número del consultorio y posteriormente realiza una llamada o envía un mensaje para solicitar información adicional. Tras consultar sobre los servicios y costos, solicita una cita, la cual, en la mayoría de los casos, es agendada directamente por el dentista, asegurando así la atención adecuada desde el primer contacto.</w:t>
-      </w:r>
-    </w:p>
-    <w:p>
-      <w:pPr>
-        <w:pStyle w:val="Prrafodelista"/>
-        <w:rPr>
-          <w:rFonts w:cs="Arial"/>
-          <w:lang w:val="es-MX"/>
-        </w:rPr>
-      </w:pPr>
-      <w:r>
-        <w:rPr>
-          <w:rFonts w:cs="Arial"/>
-          <w:lang w:val="es-MX"/>
-        </w:rPr>
         <w:t>Por ello los desórdenes en la agenda manual y la falta de un sistema estandarizado generan demoras, citas duplicadas, conflictos de horarios y dificultades para hacer seguimiento a los pacientes. Estas situaciones se evidencian en la experiencia diaria del consultorio, donde tanto pacientes como personal reportan confusión y tiempos de espera prolongados. La ineficiente gestión de citas afecta la satisfacción del paciente, reduce la eficiencia del personal y puede provocar pérdida de clientes, además de incrementar la carga administrativa sobre el dentista y el asistente, lo que impacta la calidad del servicio y la organización interna del consultorio. Por ello, es necesario implementar un sistema de gestión de citas más eficiente que permita organizar correctamente los horarios, reducir errores y mejorar la experiencia del paciente, asegurando una atención más rápida, ordenada y profesional, y optimizando los recursos del consultorio.</w:t>
       </w:r>
+    </w:p>
+    <w:p>
+      <w:pPr>
+        <w:rPr>
+          <w:b/>
+          <w:bCs/>
+          <w:lang w:val="es-MX"/>
+        </w:rPr>
+      </w:pPr>
+    </w:p>
+    <w:p>
+      <w:pPr>
+        <w:rPr>
+          <w:b/>
+          <w:bCs/>
+          <w:lang w:val="es-MX"/>
+        </w:rPr>
+      </w:pPr>
     </w:p>
     <w:p>
       <w:pPr>
@@ -906,18 +1866,22 @@
           <w:rFonts w:cs="Arial"/>
           <w:lang w:val="es-MX"/>
         </w:rPr>
-        <w:t xml:space="preserve"> permitirá administrar de manera digital las reservaciones de los pacientes, ofreciendo funciones como el registro de usuarios, la programación de citas según disponibilidad. Su funcionamiento se basa en una agenda digital conectada en tiempo real, donde tanto los clientes como el administrador podrán crear, modificar o cancelar citas, además de recibir notificaciones automáticas que recuerden los compromisos agendados. El sistema será utilizado principalmente por dos tipos de usuarios: los pacientes del consultorio, que reservarán sus citas en línea, y el administrador o propietario, que controlará la agenda, actualizará la información de servicios y dará seguimiento al estado de las consultas. Estará disponible en cualquier dispositivo con acceso a internet, facilitando su uso tanto dentro del consultorio como desde la comodidad del hogar de los pacientes. En cuanto a costos, al tratarse de un desarrollo académico no generará gastos significativos, aunque en un entorno real podrían considerarse costos asociados a servidores, mantenimiento y personal técnico.</w:t>
-      </w:r>
-    </w:p>
-    <w:p>
-      <w:pPr>
-        <w:pStyle w:val="Prrafodelista"/>
-        <w:ind w:left="0"/>
+        <w:t xml:space="preserve"> permitirá administrar de manera digital las reservaciones de los pacientes, ofreciendo funciones como el registro de usuarios, la programación de citas según disponibilidad. Su funcionamiento se basa en una agenda digital conectada en tiempo real, donde tanto los clientes como el administrador podrán crear, modificar o cancelar citas, además de recibir notificaciones automáticas que recuerden los compromisos agendados. El sistema será utilizado principalmente por dos tipos de usuarios: los pacientes del consultorio, que reservarán sus citas en línea, y el administrador o propietario, que controlará la agenda, actualizará la información de servicios y dará seguimiento al estado de las consultas. Estará disponible en cualquier dispositivo con acceso a internet, facilitando su uso tanto dentro del consultorio como desde la comodidad del hogar de los pacientes. En cuanto a costos</w:t>
+      </w:r>
+      <w:r>
         <w:rPr>
           <w:rFonts w:cs="Arial"/>
           <w:lang w:val="es-MX"/>
         </w:rPr>
-      </w:pPr>
+        <w:t>, e</w:t>
+      </w:r>
+      <w:r>
+        <w:rPr>
+          <w:rFonts w:cs="Arial"/>
+          <w:lang w:val="es-MX"/>
+        </w:rPr>
+        <w:t>l sistema será implementado en un servidor web para que funcione de manera remota, lo que implicará un costo asociado al alojamiento y mantenimiento, pero el monto dependerá del servicio de hosting seleccionado.</w:t>
+      </w:r>
     </w:p>
     <w:p>
       <w:pPr>
@@ -2831,6 +3795,312 @@
           <w:lang w:val="es-MX"/>
         </w:rPr>
         <w:t>Capacidad de manejar un mayor número de usuarios conforme crezca el negocio.</w:t>
+      </w:r>
+    </w:p>
+    <w:p>
+      <w:pPr>
+        <w:rPr>
+          <w:lang w:val="es-MX"/>
+        </w:rPr>
+      </w:pPr>
+    </w:p>
+    <w:p>
+      <w:pPr>
+        <w:rPr>
+          <w:lang w:val="es-MX"/>
+        </w:rPr>
+      </w:pPr>
+    </w:p>
+    <w:p>
+      <w:pPr>
+        <w:rPr>
+          <w:lang w:val="es-MX"/>
+        </w:rPr>
+      </w:pPr>
+    </w:p>
+    <w:p>
+      <w:pPr>
+        <w:rPr>
+          <w:lang w:val="es-MX"/>
+        </w:rPr>
+      </w:pPr>
+    </w:p>
+    <w:p>
+      <w:pPr>
+        <w:rPr>
+          <w:lang w:val="es-MX"/>
+        </w:rPr>
+      </w:pPr>
+    </w:p>
+    <w:p>
+      <w:pPr>
+        <w:rPr>
+          <w:lang w:val="es-MX"/>
+        </w:rPr>
+      </w:pPr>
+    </w:p>
+    <w:p>
+      <w:pPr>
+        <w:rPr>
+          <w:lang w:val="es-MX"/>
+        </w:rPr>
+      </w:pPr>
+    </w:p>
+    <w:p>
+      <w:pPr>
+        <w:rPr>
+          <w:lang w:val="es-MX"/>
+        </w:rPr>
+      </w:pPr>
+    </w:p>
+    <w:p>
+      <w:pPr>
+        <w:rPr>
+          <w:lang w:val="es-MX"/>
+        </w:rPr>
+      </w:pPr>
+    </w:p>
+    <w:p>
+      <w:pPr>
+        <w:rPr>
+          <w:lang w:val="es-MX"/>
+        </w:rPr>
+      </w:pPr>
+    </w:p>
+    <w:p>
+      <w:pPr>
+        <w:rPr>
+          <w:lang w:val="es-MX"/>
+        </w:rPr>
+      </w:pPr>
+    </w:p>
+    <w:p>
+      <w:pPr>
+        <w:rPr>
+          <w:lang w:val="es-MX"/>
+        </w:rPr>
+      </w:pPr>
+    </w:p>
+    <w:p>
+      <w:pPr>
+        <w:rPr>
+          <w:lang w:val="es-MX"/>
+        </w:rPr>
+      </w:pPr>
+    </w:p>
+    <w:p>
+      <w:pPr>
+        <w:rPr>
+          <w:lang w:val="es-MX"/>
+        </w:rPr>
+      </w:pPr>
+    </w:p>
+    <w:p>
+      <w:pPr>
+        <w:rPr>
+          <w:sz w:val="28"/>
+          <w:szCs w:val="24"/>
+          <w:lang w:val="es-MX"/>
+        </w:rPr>
+      </w:pPr>
+      <w:r>
+        <w:rPr>
+          <w:sz w:val="28"/>
+          <w:szCs w:val="24"/>
+          <w:lang w:val="es-MX"/>
+        </w:rPr>
+        <w:lastRenderedPageBreak/>
+        <w:t>Propuesta de valor</w:t>
+      </w:r>
+    </w:p>
+    <w:p>
+      <w:pPr>
+        <w:rPr>
+          <w:lang w:val="es-MX"/>
+        </w:rPr>
+      </w:pPr>
+      <w:r>
+        <w:rPr>
+          <w:lang w:val="es-MX"/>
+        </w:rPr>
+        <w:t>S</w:t>
+      </w:r>
+      <w:r>
+        <w:rPr>
+          <w:lang w:val="es-MX"/>
+        </w:rPr>
+        <w:t>istema de gestión de citas</w:t>
+      </w:r>
+    </w:p>
+    <w:p>
+      <w:pPr>
+        <w:numPr>
+          <w:ilvl w:val="0"/>
+          <w:numId w:val="48"/>
+        </w:numPr>
+        <w:rPr>
+          <w:lang w:val="es-MX"/>
+        </w:rPr>
+      </w:pPr>
+      <w:r>
+        <w:rPr>
+          <w:lang w:val="es-MX"/>
+        </w:rPr>
+        <w:t>Calendario sincronizado para clientes y administradores</w:t>
+      </w:r>
+      <w:r>
+        <w:rPr>
+          <w:lang w:val="es-MX"/>
+        </w:rPr>
+        <w:t>:</w:t>
+      </w:r>
+      <w:r>
+        <w:rPr>
+          <w:lang w:val="es-MX"/>
+        </w:rPr>
+        <w:br/>
+      </w:r>
+      <w:r>
+        <w:rPr>
+          <w:lang w:val="es-MX"/>
+        </w:rPr>
+        <w:t>Permite visualizar y gestionar todas las citas en tiempo real, evitando conflictos de horarios y ausencias.</w:t>
+      </w:r>
+    </w:p>
+    <w:p>
+      <w:pPr>
+        <w:numPr>
+          <w:ilvl w:val="0"/>
+          <w:numId w:val="48"/>
+        </w:numPr>
+        <w:rPr>
+          <w:lang w:val="es-MX"/>
+        </w:rPr>
+      </w:pPr>
+      <w:r>
+        <w:rPr>
+          <w:lang w:val="es-MX"/>
+        </w:rPr>
+        <w:t>Notificaciones y recordatorios automáticos</w:t>
+      </w:r>
+      <w:r>
+        <w:rPr>
+          <w:lang w:val="es-MX"/>
+        </w:rPr>
+        <w:t>:</w:t>
+      </w:r>
+    </w:p>
+    <w:p>
+      <w:pPr>
+        <w:ind w:left="720"/>
+        <w:rPr>
+          <w:lang w:val="es-MX"/>
+        </w:rPr>
+      </w:pPr>
+      <w:r>
+        <w:rPr>
+          <w:lang w:val="es-MX"/>
+        </w:rPr>
+        <w:t>Envía avisos a clientes y administradores sobre próximas citas, cambios o cancelaciones, reduciendo inasistencias.</w:t>
+      </w:r>
+    </w:p>
+    <w:p>
+      <w:pPr>
+        <w:numPr>
+          <w:ilvl w:val="0"/>
+          <w:numId w:val="48"/>
+        </w:numPr>
+        <w:rPr>
+          <w:lang w:val="es-MX"/>
+        </w:rPr>
+      </w:pPr>
+      <w:r>
+        <w:rPr>
+          <w:lang w:val="es-MX"/>
+        </w:rPr>
+        <w:t>Gestión de servicios y duración personalizada</w:t>
+      </w:r>
+      <w:r>
+        <w:rPr>
+          <w:lang w:val="es-MX"/>
+        </w:rPr>
+        <w:t>:</w:t>
+      </w:r>
+    </w:p>
+    <w:p>
+      <w:pPr>
+        <w:ind w:left="720"/>
+        <w:rPr>
+          <w:lang w:val="es-MX"/>
+        </w:rPr>
+      </w:pPr>
+      <w:r>
+        <w:rPr>
+          <w:lang w:val="es-MX"/>
+        </w:rPr>
+        <w:t>Cada tipo de servicio tiene su duración definida, permitiendo asignar horarios precisos y optimizar la agenda del consultorio.</w:t>
+      </w:r>
+    </w:p>
+    <w:p>
+      <w:pPr>
+        <w:numPr>
+          <w:ilvl w:val="0"/>
+          <w:numId w:val="48"/>
+        </w:numPr>
+        <w:rPr>
+          <w:lang w:val="es-MX"/>
+        </w:rPr>
+      </w:pPr>
+      <w:r>
+        <w:rPr>
+          <w:lang w:val="es-MX"/>
+        </w:rPr>
+        <w:t xml:space="preserve">Panel administrativo completo: </w:t>
+      </w:r>
+    </w:p>
+    <w:p>
+      <w:pPr>
+        <w:ind w:left="720"/>
+        <w:rPr>
+          <w:lang w:val="es-MX"/>
+        </w:rPr>
+      </w:pPr>
+      <w:r>
+        <w:rPr>
+          <w:lang w:val="es-MX"/>
+        </w:rPr>
+        <w:t>Permite filtrar, actualizar y controlar el estado de las citas, con visibilidad de todas las operaciones desde un solo lugar.</w:t>
+      </w:r>
+    </w:p>
+    <w:p>
+      <w:pPr>
+        <w:numPr>
+          <w:ilvl w:val="0"/>
+          <w:numId w:val="48"/>
+        </w:numPr>
+        <w:rPr>
+          <w:lang w:val="es-MX"/>
+        </w:rPr>
+      </w:pPr>
+      <w:r>
+        <w:rPr>
+          <w:lang w:val="es-MX"/>
+        </w:rPr>
+        <w:t xml:space="preserve">Acceso multiplataforma sin depender de versiones premium: </w:t>
+      </w:r>
+    </w:p>
+    <w:p>
+      <w:pPr>
+        <w:ind w:left="720"/>
+        <w:rPr>
+          <w:lang w:val="es-MX"/>
+        </w:rPr>
+      </w:pPr>
+      <w:r>
+        <w:rPr>
+          <w:lang w:val="es-MX"/>
+        </w:rPr>
+        <w:t>Disponible desde web y móvil, garantizando funcionalidades completas sin limitar al usuario con suscripciones pagadas.</w:t>
       </w:r>
     </w:p>
     <w:p>
@@ -5869,6 +7139,155 @@
     </w:lvl>
   </w:abstractNum>
   <w:abstractNum w:abstractNumId="23" w15:restartNumberingAfterBreak="0">
+    <w:nsid w:val="41353DA4"/>
+    <w:multiLevelType w:val="multilevel"/>
+    <w:tmpl w:val="F0604E90"/>
+    <w:lvl w:ilvl="0">
+      <w:start w:val="1"/>
+      <w:numFmt w:val="bullet"/>
+      <w:lvlText w:val=""/>
+      <w:lvlJc w:val="left"/>
+      <w:pPr>
+        <w:tabs>
+          <w:tab w:val="num" w:pos="1080"/>
+        </w:tabs>
+        <w:ind w:left="1080" w:hanging="360"/>
+      </w:pPr>
+      <w:rPr>
+        <w:rFonts w:ascii="Symbol" w:hAnsi="Symbol" w:hint="default"/>
+        <w:sz w:val="20"/>
+      </w:rPr>
+    </w:lvl>
+    <w:lvl w:ilvl="1">
+      <w:start w:val="1"/>
+      <w:numFmt w:val="bullet"/>
+      <w:lvlText w:val="o"/>
+      <w:lvlJc w:val="left"/>
+      <w:pPr>
+        <w:tabs>
+          <w:tab w:val="num" w:pos="1800"/>
+        </w:tabs>
+        <w:ind w:left="1800" w:hanging="360"/>
+      </w:pPr>
+      <w:rPr>
+        <w:rFonts w:ascii="Courier New" w:hAnsi="Courier New" w:cs="Times New Roman" w:hint="default"/>
+        <w:sz w:val="20"/>
+      </w:rPr>
+    </w:lvl>
+    <w:lvl w:ilvl="2">
+      <w:start w:val="1"/>
+      <w:numFmt w:val="bullet"/>
+      <w:lvlText w:val=""/>
+      <w:lvlJc w:val="left"/>
+      <w:pPr>
+        <w:tabs>
+          <w:tab w:val="num" w:pos="2520"/>
+        </w:tabs>
+        <w:ind w:left="2520" w:hanging="360"/>
+      </w:pPr>
+      <w:rPr>
+        <w:rFonts w:ascii="Wingdings" w:hAnsi="Wingdings" w:hint="default"/>
+        <w:sz w:val="20"/>
+      </w:rPr>
+    </w:lvl>
+    <w:lvl w:ilvl="3">
+      <w:start w:val="1"/>
+      <w:numFmt w:val="bullet"/>
+      <w:lvlText w:val=""/>
+      <w:lvlJc w:val="left"/>
+      <w:pPr>
+        <w:tabs>
+          <w:tab w:val="num" w:pos="3240"/>
+        </w:tabs>
+        <w:ind w:left="3240" w:hanging="360"/>
+      </w:pPr>
+      <w:rPr>
+        <w:rFonts w:ascii="Wingdings" w:hAnsi="Wingdings" w:hint="default"/>
+        <w:sz w:val="20"/>
+      </w:rPr>
+    </w:lvl>
+    <w:lvl w:ilvl="4">
+      <w:start w:val="1"/>
+      <w:numFmt w:val="bullet"/>
+      <w:lvlText w:val=""/>
+      <w:lvlJc w:val="left"/>
+      <w:pPr>
+        <w:tabs>
+          <w:tab w:val="num" w:pos="3960"/>
+        </w:tabs>
+        <w:ind w:left="3960" w:hanging="360"/>
+      </w:pPr>
+      <w:rPr>
+        <w:rFonts w:ascii="Wingdings" w:hAnsi="Wingdings" w:hint="default"/>
+        <w:sz w:val="20"/>
+      </w:rPr>
+    </w:lvl>
+    <w:lvl w:ilvl="5">
+      <w:start w:val="1"/>
+      <w:numFmt w:val="bullet"/>
+      <w:lvlText w:val=""/>
+      <w:lvlJc w:val="left"/>
+      <w:pPr>
+        <w:tabs>
+          <w:tab w:val="num" w:pos="4680"/>
+        </w:tabs>
+        <w:ind w:left="4680" w:hanging="360"/>
+      </w:pPr>
+      <w:rPr>
+        <w:rFonts w:ascii="Wingdings" w:hAnsi="Wingdings" w:hint="default"/>
+        <w:sz w:val="20"/>
+      </w:rPr>
+    </w:lvl>
+    <w:lvl w:ilvl="6">
+      <w:start w:val="1"/>
+      <w:numFmt w:val="bullet"/>
+      <w:lvlText w:val=""/>
+      <w:lvlJc w:val="left"/>
+      <w:pPr>
+        <w:tabs>
+          <w:tab w:val="num" w:pos="5400"/>
+        </w:tabs>
+        <w:ind w:left="5400" w:hanging="360"/>
+      </w:pPr>
+      <w:rPr>
+        <w:rFonts w:ascii="Wingdings" w:hAnsi="Wingdings" w:hint="default"/>
+        <w:sz w:val="20"/>
+      </w:rPr>
+    </w:lvl>
+    <w:lvl w:ilvl="7">
+      <w:start w:val="1"/>
+      <w:numFmt w:val="bullet"/>
+      <w:lvlText w:val=""/>
+      <w:lvlJc w:val="left"/>
+      <w:pPr>
+        <w:tabs>
+          <w:tab w:val="num" w:pos="6120"/>
+        </w:tabs>
+        <w:ind w:left="6120" w:hanging="360"/>
+      </w:pPr>
+      <w:rPr>
+        <w:rFonts w:ascii="Wingdings" w:hAnsi="Wingdings" w:hint="default"/>
+        <w:sz w:val="20"/>
+      </w:rPr>
+    </w:lvl>
+    <w:lvl w:ilvl="8">
+      <w:start w:val="1"/>
+      <w:numFmt w:val="bullet"/>
+      <w:lvlText w:val=""/>
+      <w:lvlJc w:val="left"/>
+      <w:pPr>
+        <w:tabs>
+          <w:tab w:val="num" w:pos="6840"/>
+        </w:tabs>
+        <w:ind w:left="6840" w:hanging="360"/>
+      </w:pPr>
+      <w:rPr>
+        <w:rFonts w:ascii="Wingdings" w:hAnsi="Wingdings" w:hint="default"/>
+        <w:sz w:val="20"/>
+      </w:rPr>
+    </w:lvl>
+  </w:abstractNum>
+  <w:abstractNum w:abstractNumId="24" w15:restartNumberingAfterBreak="0">
     <w:nsid w:val="4766633D"/>
     <w:multiLevelType w:val="hybridMultilevel"/>
     <w:tmpl w:val="E0582F4A"/>
@@ -5954,7 +7373,7 @@
       </w:pPr>
     </w:lvl>
   </w:abstractNum>
-  <w:abstractNum w:abstractNumId="24" w15:restartNumberingAfterBreak="0">
+  <w:abstractNum w:abstractNumId="25" w15:restartNumberingAfterBreak="0">
     <w:nsid w:val="47CC2EB9"/>
     <w:multiLevelType w:val="hybridMultilevel"/>
     <w:tmpl w:val="2062954A"/>
@@ -6067,7 +7486,7 @@
       </w:rPr>
     </w:lvl>
   </w:abstractNum>
-  <w:abstractNum w:abstractNumId="25" w15:restartNumberingAfterBreak="0">
+  <w:abstractNum w:abstractNumId="26" w15:restartNumberingAfterBreak="0">
     <w:nsid w:val="4A6E2752"/>
     <w:multiLevelType w:val="hybridMultilevel"/>
     <w:tmpl w:val="75EA2434"/>
@@ -6160,7 +7579,7 @@
       </w:pPr>
     </w:lvl>
   </w:abstractNum>
-  <w:abstractNum w:abstractNumId="26" w15:restartNumberingAfterBreak="0">
+  <w:abstractNum w:abstractNumId="27" w15:restartNumberingAfterBreak="0">
     <w:nsid w:val="4B0B3512"/>
     <w:multiLevelType w:val="hybridMultilevel"/>
     <w:tmpl w:val="653AE18E"/>
@@ -6273,7 +7692,7 @@
       </w:rPr>
     </w:lvl>
   </w:abstractNum>
-  <w:abstractNum w:abstractNumId="27" w15:restartNumberingAfterBreak="0">
+  <w:abstractNum w:abstractNumId="28" w15:restartNumberingAfterBreak="0">
     <w:nsid w:val="50D84393"/>
     <w:multiLevelType w:val="hybridMultilevel"/>
     <w:tmpl w:val="33CEF4F6"/>
@@ -6386,7 +7805,7 @@
       </w:rPr>
     </w:lvl>
   </w:abstractNum>
-  <w:abstractNum w:abstractNumId="28" w15:restartNumberingAfterBreak="0">
+  <w:abstractNum w:abstractNumId="29" w15:restartNumberingAfterBreak="0">
     <w:nsid w:val="51740EB5"/>
     <w:multiLevelType w:val="multilevel"/>
     <w:tmpl w:val="D50A7E6C"/>
@@ -6535,7 +7954,7 @@
       </w:rPr>
     </w:lvl>
   </w:abstractNum>
-  <w:abstractNum w:abstractNumId="29" w15:restartNumberingAfterBreak="0">
+  <w:abstractNum w:abstractNumId="30" w15:restartNumberingAfterBreak="0">
     <w:nsid w:val="52362840"/>
     <w:multiLevelType w:val="multilevel"/>
     <w:tmpl w:val="17349546"/>
@@ -6684,7 +8103,7 @@
       </w:rPr>
     </w:lvl>
   </w:abstractNum>
-  <w:abstractNum w:abstractNumId="30" w15:restartNumberingAfterBreak="0">
+  <w:abstractNum w:abstractNumId="31" w15:restartNumberingAfterBreak="0">
     <w:nsid w:val="52CB71DA"/>
     <w:multiLevelType w:val="hybridMultilevel"/>
     <w:tmpl w:val="3222CCC6"/>
@@ -6797,7 +8216,120 @@
       </w:rPr>
     </w:lvl>
   </w:abstractNum>
-  <w:abstractNum w:abstractNumId="31" w15:restartNumberingAfterBreak="0">
+  <w:abstractNum w:abstractNumId="32" w15:restartNumberingAfterBreak="0">
+    <w:nsid w:val="53B87735"/>
+    <w:multiLevelType w:val="multilevel"/>
+    <w:tmpl w:val="F2343624"/>
+    <w:lvl w:ilvl="0">
+      <w:start w:val="1"/>
+      <w:numFmt w:val="decimal"/>
+      <w:lvlText w:val="%1."/>
+      <w:lvlJc w:val="left"/>
+      <w:pPr>
+        <w:tabs>
+          <w:tab w:val="num" w:pos="720"/>
+        </w:tabs>
+        <w:ind w:left="720" w:hanging="360"/>
+      </w:pPr>
+    </w:lvl>
+    <w:lvl w:ilvl="1" w:tentative="1">
+      <w:start w:val="1"/>
+      <w:numFmt w:val="decimal"/>
+      <w:lvlText w:val="%2."/>
+      <w:lvlJc w:val="left"/>
+      <w:pPr>
+        <w:tabs>
+          <w:tab w:val="num" w:pos="1440"/>
+        </w:tabs>
+        <w:ind w:left="1440" w:hanging="360"/>
+      </w:pPr>
+    </w:lvl>
+    <w:lvl w:ilvl="2" w:tentative="1">
+      <w:start w:val="1"/>
+      <w:numFmt w:val="decimal"/>
+      <w:lvlText w:val="%3."/>
+      <w:lvlJc w:val="left"/>
+      <w:pPr>
+        <w:tabs>
+          <w:tab w:val="num" w:pos="2160"/>
+        </w:tabs>
+        <w:ind w:left="2160" w:hanging="360"/>
+      </w:pPr>
+    </w:lvl>
+    <w:lvl w:ilvl="3" w:tentative="1">
+      <w:start w:val="1"/>
+      <w:numFmt w:val="decimal"/>
+      <w:lvlText w:val="%4."/>
+      <w:lvlJc w:val="left"/>
+      <w:pPr>
+        <w:tabs>
+          <w:tab w:val="num" w:pos="2880"/>
+        </w:tabs>
+        <w:ind w:left="2880" w:hanging="360"/>
+      </w:pPr>
+    </w:lvl>
+    <w:lvl w:ilvl="4" w:tentative="1">
+      <w:start w:val="1"/>
+      <w:numFmt w:val="decimal"/>
+      <w:lvlText w:val="%5."/>
+      <w:lvlJc w:val="left"/>
+      <w:pPr>
+        <w:tabs>
+          <w:tab w:val="num" w:pos="3600"/>
+        </w:tabs>
+        <w:ind w:left="3600" w:hanging="360"/>
+      </w:pPr>
+    </w:lvl>
+    <w:lvl w:ilvl="5" w:tentative="1">
+      <w:start w:val="1"/>
+      <w:numFmt w:val="decimal"/>
+      <w:lvlText w:val="%6."/>
+      <w:lvlJc w:val="left"/>
+      <w:pPr>
+        <w:tabs>
+          <w:tab w:val="num" w:pos="4320"/>
+        </w:tabs>
+        <w:ind w:left="4320" w:hanging="360"/>
+      </w:pPr>
+    </w:lvl>
+    <w:lvl w:ilvl="6" w:tentative="1">
+      <w:start w:val="1"/>
+      <w:numFmt w:val="decimal"/>
+      <w:lvlText w:val="%7."/>
+      <w:lvlJc w:val="left"/>
+      <w:pPr>
+        <w:tabs>
+          <w:tab w:val="num" w:pos="5040"/>
+        </w:tabs>
+        <w:ind w:left="5040" w:hanging="360"/>
+      </w:pPr>
+    </w:lvl>
+    <w:lvl w:ilvl="7" w:tentative="1">
+      <w:start w:val="1"/>
+      <w:numFmt w:val="decimal"/>
+      <w:lvlText w:val="%8."/>
+      <w:lvlJc w:val="left"/>
+      <w:pPr>
+        <w:tabs>
+          <w:tab w:val="num" w:pos="5760"/>
+        </w:tabs>
+        <w:ind w:left="5760" w:hanging="360"/>
+      </w:pPr>
+    </w:lvl>
+    <w:lvl w:ilvl="8" w:tentative="1">
+      <w:start w:val="1"/>
+      <w:numFmt w:val="decimal"/>
+      <w:lvlText w:val="%9."/>
+      <w:lvlJc w:val="left"/>
+      <w:pPr>
+        <w:tabs>
+          <w:tab w:val="num" w:pos="6480"/>
+        </w:tabs>
+        <w:ind w:left="6480" w:hanging="360"/>
+      </w:pPr>
+    </w:lvl>
+  </w:abstractNum>
+  <w:abstractNum w:abstractNumId="33" w15:restartNumberingAfterBreak="0">
     <w:nsid w:val="546C02A0"/>
     <w:multiLevelType w:val="hybridMultilevel"/>
     <w:tmpl w:val="CB3AF246"/>
@@ -6910,7 +8442,7 @@
       </w:rPr>
     </w:lvl>
   </w:abstractNum>
-  <w:abstractNum w:abstractNumId="32" w15:restartNumberingAfterBreak="0">
+  <w:abstractNum w:abstractNumId="34" w15:restartNumberingAfterBreak="0">
     <w:nsid w:val="5C963467"/>
     <w:multiLevelType w:val="multilevel"/>
     <w:tmpl w:val="3708A74A"/>
@@ -7059,7 +8591,7 @@
       </w:rPr>
     </w:lvl>
   </w:abstractNum>
-  <w:abstractNum w:abstractNumId="33" w15:restartNumberingAfterBreak="0">
+  <w:abstractNum w:abstractNumId="35" w15:restartNumberingAfterBreak="0">
     <w:nsid w:val="5D497E52"/>
     <w:multiLevelType w:val="multilevel"/>
     <w:tmpl w:val="A8AC7C1A"/>
@@ -7176,7 +8708,7 @@
       </w:pPr>
     </w:lvl>
   </w:abstractNum>
-  <w:abstractNum w:abstractNumId="34" w15:restartNumberingAfterBreak="0">
+  <w:abstractNum w:abstractNumId="36" w15:restartNumberingAfterBreak="0">
     <w:nsid w:val="6170471D"/>
     <w:multiLevelType w:val="multilevel"/>
     <w:tmpl w:val="AB9AB6F0"/>
@@ -7325,7 +8857,7 @@
       </w:rPr>
     </w:lvl>
   </w:abstractNum>
-  <w:abstractNum w:abstractNumId="35" w15:restartNumberingAfterBreak="0">
+  <w:abstractNum w:abstractNumId="37" w15:restartNumberingAfterBreak="0">
     <w:nsid w:val="631A1B9A"/>
     <w:multiLevelType w:val="multilevel"/>
     <w:tmpl w:val="29085F44"/>
@@ -7474,7 +9006,7 @@
       </w:rPr>
     </w:lvl>
   </w:abstractNum>
-  <w:abstractNum w:abstractNumId="36" w15:restartNumberingAfterBreak="0">
+  <w:abstractNum w:abstractNumId="38" w15:restartNumberingAfterBreak="0">
     <w:nsid w:val="6438084C"/>
     <w:multiLevelType w:val="multilevel"/>
     <w:tmpl w:val="E1867B24"/>
@@ -7591,7 +9123,7 @@
       </w:pPr>
     </w:lvl>
   </w:abstractNum>
-  <w:abstractNum w:abstractNumId="37" w15:restartNumberingAfterBreak="0">
+  <w:abstractNum w:abstractNumId="39" w15:restartNumberingAfterBreak="0">
     <w:nsid w:val="644A3846"/>
     <w:multiLevelType w:val="multilevel"/>
     <w:tmpl w:val="2CAE7F72"/>
@@ -7740,7 +9272,7 @@
       </w:rPr>
     </w:lvl>
   </w:abstractNum>
-  <w:abstractNum w:abstractNumId="38" w15:restartNumberingAfterBreak="0">
+  <w:abstractNum w:abstractNumId="40" w15:restartNumberingAfterBreak="0">
     <w:nsid w:val="69AA7DB2"/>
     <w:multiLevelType w:val="hybridMultilevel"/>
     <w:tmpl w:val="E29E7ADA"/>
@@ -7829,7 +9361,7 @@
       </w:pPr>
     </w:lvl>
   </w:abstractNum>
-  <w:abstractNum w:abstractNumId="39" w15:restartNumberingAfterBreak="0">
+  <w:abstractNum w:abstractNumId="41" w15:restartNumberingAfterBreak="0">
     <w:nsid w:val="6A6E5685"/>
     <w:multiLevelType w:val="hybridMultilevel"/>
     <w:tmpl w:val="644AFB1C"/>
@@ -7943,7 +9475,156 @@
       </w:rPr>
     </w:lvl>
   </w:abstractNum>
-  <w:abstractNum w:abstractNumId="40" w15:restartNumberingAfterBreak="0">
+  <w:abstractNum w:abstractNumId="42" w15:restartNumberingAfterBreak="0">
+    <w:nsid w:val="6F1C44C0"/>
+    <w:multiLevelType w:val="multilevel"/>
+    <w:tmpl w:val="90AA6A46"/>
+    <w:lvl w:ilvl="0">
+      <w:start w:val="1"/>
+      <w:numFmt w:val="bullet"/>
+      <w:lvlText w:val=""/>
+      <w:lvlJc w:val="left"/>
+      <w:pPr>
+        <w:tabs>
+          <w:tab w:val="num" w:pos="1080"/>
+        </w:tabs>
+        <w:ind w:left="1080" w:hanging="360"/>
+      </w:pPr>
+      <w:rPr>
+        <w:rFonts w:ascii="Symbol" w:hAnsi="Symbol" w:hint="default"/>
+        <w:sz w:val="20"/>
+      </w:rPr>
+    </w:lvl>
+    <w:lvl w:ilvl="1">
+      <w:start w:val="1"/>
+      <w:numFmt w:val="bullet"/>
+      <w:lvlText w:val="o"/>
+      <w:lvlJc w:val="left"/>
+      <w:pPr>
+        <w:tabs>
+          <w:tab w:val="num" w:pos="1800"/>
+        </w:tabs>
+        <w:ind w:left="1800" w:hanging="360"/>
+      </w:pPr>
+      <w:rPr>
+        <w:rFonts w:ascii="Courier New" w:hAnsi="Courier New" w:cs="Times New Roman" w:hint="default"/>
+        <w:sz w:val="20"/>
+      </w:rPr>
+    </w:lvl>
+    <w:lvl w:ilvl="2">
+      <w:start w:val="1"/>
+      <w:numFmt w:val="bullet"/>
+      <w:lvlText w:val=""/>
+      <w:lvlJc w:val="left"/>
+      <w:pPr>
+        <w:tabs>
+          <w:tab w:val="num" w:pos="2520"/>
+        </w:tabs>
+        <w:ind w:left="2520" w:hanging="360"/>
+      </w:pPr>
+      <w:rPr>
+        <w:rFonts w:ascii="Wingdings" w:hAnsi="Wingdings" w:hint="default"/>
+        <w:sz w:val="20"/>
+      </w:rPr>
+    </w:lvl>
+    <w:lvl w:ilvl="3">
+      <w:start w:val="1"/>
+      <w:numFmt w:val="bullet"/>
+      <w:lvlText w:val=""/>
+      <w:lvlJc w:val="left"/>
+      <w:pPr>
+        <w:tabs>
+          <w:tab w:val="num" w:pos="3240"/>
+        </w:tabs>
+        <w:ind w:left="3240" w:hanging="360"/>
+      </w:pPr>
+      <w:rPr>
+        <w:rFonts w:ascii="Wingdings" w:hAnsi="Wingdings" w:hint="default"/>
+        <w:sz w:val="20"/>
+      </w:rPr>
+    </w:lvl>
+    <w:lvl w:ilvl="4">
+      <w:start w:val="1"/>
+      <w:numFmt w:val="bullet"/>
+      <w:lvlText w:val=""/>
+      <w:lvlJc w:val="left"/>
+      <w:pPr>
+        <w:tabs>
+          <w:tab w:val="num" w:pos="3960"/>
+        </w:tabs>
+        <w:ind w:left="3960" w:hanging="360"/>
+      </w:pPr>
+      <w:rPr>
+        <w:rFonts w:ascii="Wingdings" w:hAnsi="Wingdings" w:hint="default"/>
+        <w:sz w:val="20"/>
+      </w:rPr>
+    </w:lvl>
+    <w:lvl w:ilvl="5">
+      <w:start w:val="1"/>
+      <w:numFmt w:val="bullet"/>
+      <w:lvlText w:val=""/>
+      <w:lvlJc w:val="left"/>
+      <w:pPr>
+        <w:tabs>
+          <w:tab w:val="num" w:pos="4680"/>
+        </w:tabs>
+        <w:ind w:left="4680" w:hanging="360"/>
+      </w:pPr>
+      <w:rPr>
+        <w:rFonts w:ascii="Wingdings" w:hAnsi="Wingdings" w:hint="default"/>
+        <w:sz w:val="20"/>
+      </w:rPr>
+    </w:lvl>
+    <w:lvl w:ilvl="6">
+      <w:start w:val="1"/>
+      <w:numFmt w:val="bullet"/>
+      <w:lvlText w:val=""/>
+      <w:lvlJc w:val="left"/>
+      <w:pPr>
+        <w:tabs>
+          <w:tab w:val="num" w:pos="5400"/>
+        </w:tabs>
+        <w:ind w:left="5400" w:hanging="360"/>
+      </w:pPr>
+      <w:rPr>
+        <w:rFonts w:ascii="Wingdings" w:hAnsi="Wingdings" w:hint="default"/>
+        <w:sz w:val="20"/>
+      </w:rPr>
+    </w:lvl>
+    <w:lvl w:ilvl="7">
+      <w:start w:val="1"/>
+      <w:numFmt w:val="bullet"/>
+      <w:lvlText w:val=""/>
+      <w:lvlJc w:val="left"/>
+      <w:pPr>
+        <w:tabs>
+          <w:tab w:val="num" w:pos="6120"/>
+        </w:tabs>
+        <w:ind w:left="6120" w:hanging="360"/>
+      </w:pPr>
+      <w:rPr>
+        <w:rFonts w:ascii="Wingdings" w:hAnsi="Wingdings" w:hint="default"/>
+        <w:sz w:val="20"/>
+      </w:rPr>
+    </w:lvl>
+    <w:lvl w:ilvl="8">
+      <w:start w:val="1"/>
+      <w:numFmt w:val="bullet"/>
+      <w:lvlText w:val=""/>
+      <w:lvlJc w:val="left"/>
+      <w:pPr>
+        <w:tabs>
+          <w:tab w:val="num" w:pos="6840"/>
+        </w:tabs>
+        <w:ind w:left="6840" w:hanging="360"/>
+      </w:pPr>
+      <w:rPr>
+        <w:rFonts w:ascii="Wingdings" w:hAnsi="Wingdings" w:hint="default"/>
+        <w:sz w:val="20"/>
+      </w:rPr>
+    </w:lvl>
+  </w:abstractNum>
+  <w:abstractNum w:abstractNumId="43" w15:restartNumberingAfterBreak="0">
     <w:nsid w:val="6F4027C2"/>
     <w:multiLevelType w:val="multilevel"/>
     <w:tmpl w:val="FC6EBD9E"/>
@@ -8092,7 +9773,7 @@
       </w:rPr>
     </w:lvl>
   </w:abstractNum>
-  <w:abstractNum w:abstractNumId="41" w15:restartNumberingAfterBreak="0">
+  <w:abstractNum w:abstractNumId="44" w15:restartNumberingAfterBreak="0">
     <w:nsid w:val="78356A83"/>
     <w:multiLevelType w:val="multilevel"/>
     <w:tmpl w:val="CE0AFD76"/>
@@ -8241,7 +9922,7 @@
       </w:rPr>
     </w:lvl>
   </w:abstractNum>
-  <w:abstractNum w:abstractNumId="42" w15:restartNumberingAfterBreak="0">
+  <w:abstractNum w:abstractNumId="45" w15:restartNumberingAfterBreak="0">
     <w:nsid w:val="798538F3"/>
     <w:multiLevelType w:val="multilevel"/>
     <w:tmpl w:val="1CD2E622"/>
@@ -8390,11 +10071,309 @@
       </w:rPr>
     </w:lvl>
   </w:abstractNum>
+  <w:abstractNum w:abstractNumId="46" w15:restartNumberingAfterBreak="0">
+    <w:nsid w:val="7AEA38E5"/>
+    <w:multiLevelType w:val="multilevel"/>
+    <w:tmpl w:val="D24C3AE6"/>
+    <w:lvl w:ilvl="0">
+      <w:start w:val="1"/>
+      <w:numFmt w:val="bullet"/>
+      <w:lvlText w:val=""/>
+      <w:lvlJc w:val="left"/>
+      <w:pPr>
+        <w:tabs>
+          <w:tab w:val="num" w:pos="1080"/>
+        </w:tabs>
+        <w:ind w:left="1080" w:hanging="360"/>
+      </w:pPr>
+      <w:rPr>
+        <w:rFonts w:ascii="Symbol" w:hAnsi="Symbol" w:hint="default"/>
+        <w:sz w:val="20"/>
+      </w:rPr>
+    </w:lvl>
+    <w:lvl w:ilvl="1">
+      <w:start w:val="1"/>
+      <w:numFmt w:val="bullet"/>
+      <w:lvlText w:val="o"/>
+      <w:lvlJc w:val="left"/>
+      <w:pPr>
+        <w:tabs>
+          <w:tab w:val="num" w:pos="1800"/>
+        </w:tabs>
+        <w:ind w:left="1800" w:hanging="360"/>
+      </w:pPr>
+      <w:rPr>
+        <w:rFonts w:ascii="Courier New" w:hAnsi="Courier New" w:cs="Times New Roman" w:hint="default"/>
+        <w:sz w:val="20"/>
+      </w:rPr>
+    </w:lvl>
+    <w:lvl w:ilvl="2">
+      <w:start w:val="1"/>
+      <w:numFmt w:val="bullet"/>
+      <w:lvlText w:val=""/>
+      <w:lvlJc w:val="left"/>
+      <w:pPr>
+        <w:tabs>
+          <w:tab w:val="num" w:pos="2520"/>
+        </w:tabs>
+        <w:ind w:left="2520" w:hanging="360"/>
+      </w:pPr>
+      <w:rPr>
+        <w:rFonts w:ascii="Wingdings" w:hAnsi="Wingdings" w:hint="default"/>
+        <w:sz w:val="20"/>
+      </w:rPr>
+    </w:lvl>
+    <w:lvl w:ilvl="3">
+      <w:start w:val="1"/>
+      <w:numFmt w:val="bullet"/>
+      <w:lvlText w:val=""/>
+      <w:lvlJc w:val="left"/>
+      <w:pPr>
+        <w:tabs>
+          <w:tab w:val="num" w:pos="3240"/>
+        </w:tabs>
+        <w:ind w:left="3240" w:hanging="360"/>
+      </w:pPr>
+      <w:rPr>
+        <w:rFonts w:ascii="Wingdings" w:hAnsi="Wingdings" w:hint="default"/>
+        <w:sz w:val="20"/>
+      </w:rPr>
+    </w:lvl>
+    <w:lvl w:ilvl="4">
+      <w:start w:val="1"/>
+      <w:numFmt w:val="bullet"/>
+      <w:lvlText w:val=""/>
+      <w:lvlJc w:val="left"/>
+      <w:pPr>
+        <w:tabs>
+          <w:tab w:val="num" w:pos="3960"/>
+        </w:tabs>
+        <w:ind w:left="3960" w:hanging="360"/>
+      </w:pPr>
+      <w:rPr>
+        <w:rFonts w:ascii="Wingdings" w:hAnsi="Wingdings" w:hint="default"/>
+        <w:sz w:val="20"/>
+      </w:rPr>
+    </w:lvl>
+    <w:lvl w:ilvl="5">
+      <w:start w:val="1"/>
+      <w:numFmt w:val="bullet"/>
+      <w:lvlText w:val=""/>
+      <w:lvlJc w:val="left"/>
+      <w:pPr>
+        <w:tabs>
+          <w:tab w:val="num" w:pos="4680"/>
+        </w:tabs>
+        <w:ind w:left="4680" w:hanging="360"/>
+      </w:pPr>
+      <w:rPr>
+        <w:rFonts w:ascii="Wingdings" w:hAnsi="Wingdings" w:hint="default"/>
+        <w:sz w:val="20"/>
+      </w:rPr>
+    </w:lvl>
+    <w:lvl w:ilvl="6">
+      <w:start w:val="1"/>
+      <w:numFmt w:val="bullet"/>
+      <w:lvlText w:val=""/>
+      <w:lvlJc w:val="left"/>
+      <w:pPr>
+        <w:tabs>
+          <w:tab w:val="num" w:pos="5400"/>
+        </w:tabs>
+        <w:ind w:left="5400" w:hanging="360"/>
+      </w:pPr>
+      <w:rPr>
+        <w:rFonts w:ascii="Wingdings" w:hAnsi="Wingdings" w:hint="default"/>
+        <w:sz w:val="20"/>
+      </w:rPr>
+    </w:lvl>
+    <w:lvl w:ilvl="7">
+      <w:start w:val="1"/>
+      <w:numFmt w:val="bullet"/>
+      <w:lvlText w:val=""/>
+      <w:lvlJc w:val="left"/>
+      <w:pPr>
+        <w:tabs>
+          <w:tab w:val="num" w:pos="6120"/>
+        </w:tabs>
+        <w:ind w:left="6120" w:hanging="360"/>
+      </w:pPr>
+      <w:rPr>
+        <w:rFonts w:ascii="Wingdings" w:hAnsi="Wingdings" w:hint="default"/>
+        <w:sz w:val="20"/>
+      </w:rPr>
+    </w:lvl>
+    <w:lvl w:ilvl="8">
+      <w:start w:val="1"/>
+      <w:numFmt w:val="bullet"/>
+      <w:lvlText w:val=""/>
+      <w:lvlJc w:val="left"/>
+      <w:pPr>
+        <w:tabs>
+          <w:tab w:val="num" w:pos="6840"/>
+        </w:tabs>
+        <w:ind w:left="6840" w:hanging="360"/>
+      </w:pPr>
+      <w:rPr>
+        <w:rFonts w:ascii="Wingdings" w:hAnsi="Wingdings" w:hint="default"/>
+        <w:sz w:val="20"/>
+      </w:rPr>
+    </w:lvl>
+  </w:abstractNum>
+  <w:abstractNum w:abstractNumId="47" w15:restartNumberingAfterBreak="0">
+    <w:nsid w:val="7EF26AA9"/>
+    <w:multiLevelType w:val="multilevel"/>
+    <w:tmpl w:val="294A8A42"/>
+    <w:lvl w:ilvl="0">
+      <w:start w:val="1"/>
+      <w:numFmt w:val="bullet"/>
+      <w:lvlText w:val=""/>
+      <w:lvlJc w:val="left"/>
+      <w:pPr>
+        <w:tabs>
+          <w:tab w:val="num" w:pos="1080"/>
+        </w:tabs>
+        <w:ind w:left="1080" w:hanging="360"/>
+      </w:pPr>
+      <w:rPr>
+        <w:rFonts w:ascii="Symbol" w:hAnsi="Symbol" w:hint="default"/>
+        <w:sz w:val="20"/>
+      </w:rPr>
+    </w:lvl>
+    <w:lvl w:ilvl="1">
+      <w:start w:val="1"/>
+      <w:numFmt w:val="bullet"/>
+      <w:lvlText w:val="o"/>
+      <w:lvlJc w:val="left"/>
+      <w:pPr>
+        <w:tabs>
+          <w:tab w:val="num" w:pos="1800"/>
+        </w:tabs>
+        <w:ind w:left="1800" w:hanging="360"/>
+      </w:pPr>
+      <w:rPr>
+        <w:rFonts w:ascii="Courier New" w:hAnsi="Courier New" w:cs="Times New Roman" w:hint="default"/>
+        <w:sz w:val="20"/>
+      </w:rPr>
+    </w:lvl>
+    <w:lvl w:ilvl="2">
+      <w:start w:val="1"/>
+      <w:numFmt w:val="bullet"/>
+      <w:lvlText w:val=""/>
+      <w:lvlJc w:val="left"/>
+      <w:pPr>
+        <w:tabs>
+          <w:tab w:val="num" w:pos="2520"/>
+        </w:tabs>
+        <w:ind w:left="2520" w:hanging="360"/>
+      </w:pPr>
+      <w:rPr>
+        <w:rFonts w:ascii="Wingdings" w:hAnsi="Wingdings" w:hint="default"/>
+        <w:sz w:val="20"/>
+      </w:rPr>
+    </w:lvl>
+    <w:lvl w:ilvl="3">
+      <w:start w:val="1"/>
+      <w:numFmt w:val="bullet"/>
+      <w:lvlText w:val=""/>
+      <w:lvlJc w:val="left"/>
+      <w:pPr>
+        <w:tabs>
+          <w:tab w:val="num" w:pos="3240"/>
+        </w:tabs>
+        <w:ind w:left="3240" w:hanging="360"/>
+      </w:pPr>
+      <w:rPr>
+        <w:rFonts w:ascii="Wingdings" w:hAnsi="Wingdings" w:hint="default"/>
+        <w:sz w:val="20"/>
+      </w:rPr>
+    </w:lvl>
+    <w:lvl w:ilvl="4">
+      <w:start w:val="1"/>
+      <w:numFmt w:val="bullet"/>
+      <w:lvlText w:val=""/>
+      <w:lvlJc w:val="left"/>
+      <w:pPr>
+        <w:tabs>
+          <w:tab w:val="num" w:pos="3960"/>
+        </w:tabs>
+        <w:ind w:left="3960" w:hanging="360"/>
+      </w:pPr>
+      <w:rPr>
+        <w:rFonts w:ascii="Wingdings" w:hAnsi="Wingdings" w:hint="default"/>
+        <w:sz w:val="20"/>
+      </w:rPr>
+    </w:lvl>
+    <w:lvl w:ilvl="5">
+      <w:start w:val="1"/>
+      <w:numFmt w:val="bullet"/>
+      <w:lvlText w:val=""/>
+      <w:lvlJc w:val="left"/>
+      <w:pPr>
+        <w:tabs>
+          <w:tab w:val="num" w:pos="4680"/>
+        </w:tabs>
+        <w:ind w:left="4680" w:hanging="360"/>
+      </w:pPr>
+      <w:rPr>
+        <w:rFonts w:ascii="Wingdings" w:hAnsi="Wingdings" w:hint="default"/>
+        <w:sz w:val="20"/>
+      </w:rPr>
+    </w:lvl>
+    <w:lvl w:ilvl="6">
+      <w:start w:val="1"/>
+      <w:numFmt w:val="bullet"/>
+      <w:lvlText w:val=""/>
+      <w:lvlJc w:val="left"/>
+      <w:pPr>
+        <w:tabs>
+          <w:tab w:val="num" w:pos="5400"/>
+        </w:tabs>
+        <w:ind w:left="5400" w:hanging="360"/>
+      </w:pPr>
+      <w:rPr>
+        <w:rFonts w:ascii="Wingdings" w:hAnsi="Wingdings" w:hint="default"/>
+        <w:sz w:val="20"/>
+      </w:rPr>
+    </w:lvl>
+    <w:lvl w:ilvl="7">
+      <w:start w:val="1"/>
+      <w:numFmt w:val="bullet"/>
+      <w:lvlText w:val=""/>
+      <w:lvlJc w:val="left"/>
+      <w:pPr>
+        <w:tabs>
+          <w:tab w:val="num" w:pos="6120"/>
+        </w:tabs>
+        <w:ind w:left="6120" w:hanging="360"/>
+      </w:pPr>
+      <w:rPr>
+        <w:rFonts w:ascii="Wingdings" w:hAnsi="Wingdings" w:hint="default"/>
+        <w:sz w:val="20"/>
+      </w:rPr>
+    </w:lvl>
+    <w:lvl w:ilvl="8">
+      <w:start w:val="1"/>
+      <w:numFmt w:val="bullet"/>
+      <w:lvlText w:val=""/>
+      <w:lvlJc w:val="left"/>
+      <w:pPr>
+        <w:tabs>
+          <w:tab w:val="num" w:pos="6840"/>
+        </w:tabs>
+        <w:ind w:left="6840" w:hanging="360"/>
+      </w:pPr>
+      <w:rPr>
+        <w:rFonts w:ascii="Wingdings" w:hAnsi="Wingdings" w:hint="default"/>
+        <w:sz w:val="20"/>
+      </w:rPr>
+    </w:lvl>
+  </w:abstractNum>
   <w:num w:numId="1" w16cid:durableId="1288273530">
-    <w:abstractNumId w:val="34"/>
+    <w:abstractNumId w:val="36"/>
   </w:num>
   <w:num w:numId="2" w16cid:durableId="54742117">
-    <w:abstractNumId w:val="40"/>
+    <w:abstractNumId w:val="43"/>
   </w:num>
   <w:num w:numId="3" w16cid:durableId="1905527031">
     <w:abstractNumId w:val="8"/>
@@ -8406,10 +10385,10 @@
     <w:abstractNumId w:val="2"/>
   </w:num>
   <w:num w:numId="6" w16cid:durableId="766998451">
-    <w:abstractNumId w:val="32"/>
+    <w:abstractNumId w:val="34"/>
   </w:num>
   <w:num w:numId="7" w16cid:durableId="1785154798">
-    <w:abstractNumId w:val="37"/>
+    <w:abstractNumId w:val="39"/>
   </w:num>
   <w:num w:numId="8" w16cid:durableId="1272008442">
     <w:abstractNumId w:val="9"/>
@@ -8421,16 +10400,16 @@
     <w:abstractNumId w:val="6"/>
   </w:num>
   <w:num w:numId="11" w16cid:durableId="829295931">
-    <w:abstractNumId w:val="41"/>
+    <w:abstractNumId w:val="44"/>
   </w:num>
   <w:num w:numId="12" w16cid:durableId="1121656083">
-    <w:abstractNumId w:val="28"/>
+    <w:abstractNumId w:val="29"/>
   </w:num>
   <w:num w:numId="13" w16cid:durableId="756907059">
     <w:abstractNumId w:val="11"/>
   </w:num>
   <w:num w:numId="14" w16cid:durableId="159665419">
-    <w:abstractNumId w:val="30"/>
+    <w:abstractNumId w:val="31"/>
   </w:num>
   <w:num w:numId="15" w16cid:durableId="273636218">
     <w:abstractNumId w:val="13"/>
@@ -8439,22 +10418,22 @@
     <w:abstractNumId w:val="19"/>
   </w:num>
   <w:num w:numId="17" w16cid:durableId="686365819">
-    <w:abstractNumId w:val="33"/>
+    <w:abstractNumId w:val="35"/>
   </w:num>
   <w:num w:numId="18" w16cid:durableId="1084910307">
-    <w:abstractNumId w:val="36"/>
+    <w:abstractNumId w:val="38"/>
   </w:num>
   <w:num w:numId="19" w16cid:durableId="927615154">
     <w:abstractNumId w:val="7"/>
   </w:num>
   <w:num w:numId="20" w16cid:durableId="1030299891">
-    <w:abstractNumId w:val="23"/>
+    <w:abstractNumId w:val="24"/>
   </w:num>
   <w:num w:numId="21" w16cid:durableId="92865183">
-    <w:abstractNumId w:val="24"/>
+    <w:abstractNumId w:val="25"/>
   </w:num>
   <w:num w:numId="22" w16cid:durableId="1912959736">
-    <w:abstractNumId w:val="31"/>
+    <w:abstractNumId w:val="33"/>
   </w:num>
   <w:num w:numId="23" w16cid:durableId="931813402">
     <w:abstractNumId w:val="14"/>
@@ -8469,19 +10448,19 @@
     <w:abstractNumId w:val="10"/>
   </w:num>
   <w:num w:numId="27" w16cid:durableId="1959292273">
-    <w:abstractNumId w:val="27"/>
+    <w:abstractNumId w:val="28"/>
   </w:num>
   <w:num w:numId="28" w16cid:durableId="2145391666">
     <w:abstractNumId w:val="3"/>
   </w:num>
   <w:num w:numId="29" w16cid:durableId="126975843">
-    <w:abstractNumId w:val="35"/>
+    <w:abstractNumId w:val="37"/>
   </w:num>
   <w:num w:numId="30" w16cid:durableId="1304576247">
     <w:abstractNumId w:val="0"/>
   </w:num>
   <w:num w:numId="31" w16cid:durableId="337316575">
-    <w:abstractNumId w:val="26"/>
+    <w:abstractNumId w:val="27"/>
   </w:num>
   <w:num w:numId="32" w16cid:durableId="159929823">
     <w:abstractNumId w:val="22"/>
@@ -8490,7 +10469,7 @@
     <w:abstractNumId w:val="15"/>
   </w:num>
   <w:num w:numId="34" w16cid:durableId="1509439291">
-    <w:abstractNumId w:val="29"/>
+    <w:abstractNumId w:val="30"/>
   </w:num>
   <w:num w:numId="35" w16cid:durableId="1280448961">
     <w:abstractNumId w:val="16"/>
@@ -8499,10 +10478,10 @@
     <w:abstractNumId w:val="4"/>
   </w:num>
   <w:num w:numId="37" w16cid:durableId="1438212677">
-    <w:abstractNumId w:val="25"/>
+    <w:abstractNumId w:val="26"/>
   </w:num>
   <w:num w:numId="38" w16cid:durableId="1999531309">
-    <w:abstractNumId w:val="39"/>
+    <w:abstractNumId w:val="41"/>
   </w:num>
   <w:num w:numId="39" w16cid:durableId="1840190504">
     <w:abstractNumId w:val="5"/>
@@ -8514,10 +10493,61 @@
     <w:abstractNumId w:val="18"/>
   </w:num>
   <w:num w:numId="42" w16cid:durableId="1259369355">
-    <w:abstractNumId w:val="38"/>
+    <w:abstractNumId w:val="40"/>
   </w:num>
   <w:num w:numId="43" w16cid:durableId="1742019541">
+    <w:abstractNumId w:val="45"/>
+  </w:num>
+  <w:num w:numId="44" w16cid:durableId="1337464252">
     <w:abstractNumId w:val="42"/>
+    <w:lvlOverride w:ilvl="0"/>
+    <w:lvlOverride w:ilvl="1"/>
+    <w:lvlOverride w:ilvl="2"/>
+    <w:lvlOverride w:ilvl="3"/>
+    <w:lvlOverride w:ilvl="4"/>
+    <w:lvlOverride w:ilvl="5"/>
+    <w:lvlOverride w:ilvl="6"/>
+    <w:lvlOverride w:ilvl="7"/>
+    <w:lvlOverride w:ilvl="8"/>
+  </w:num>
+  <w:num w:numId="45" w16cid:durableId="1619067337">
+    <w:abstractNumId w:val="46"/>
+    <w:lvlOverride w:ilvl="0"/>
+    <w:lvlOverride w:ilvl="1"/>
+    <w:lvlOverride w:ilvl="2"/>
+    <w:lvlOverride w:ilvl="3"/>
+    <w:lvlOverride w:ilvl="4"/>
+    <w:lvlOverride w:ilvl="5"/>
+    <w:lvlOverride w:ilvl="6"/>
+    <w:lvlOverride w:ilvl="7"/>
+    <w:lvlOverride w:ilvl="8"/>
+  </w:num>
+  <w:num w:numId="46" w16cid:durableId="1347753116">
+    <w:abstractNumId w:val="23"/>
+    <w:lvlOverride w:ilvl="0"/>
+    <w:lvlOverride w:ilvl="1"/>
+    <w:lvlOverride w:ilvl="2"/>
+    <w:lvlOverride w:ilvl="3"/>
+    <w:lvlOverride w:ilvl="4"/>
+    <w:lvlOverride w:ilvl="5"/>
+    <w:lvlOverride w:ilvl="6"/>
+    <w:lvlOverride w:ilvl="7"/>
+    <w:lvlOverride w:ilvl="8"/>
+  </w:num>
+  <w:num w:numId="47" w16cid:durableId="537551863">
+    <w:abstractNumId w:val="47"/>
+    <w:lvlOverride w:ilvl="0"/>
+    <w:lvlOverride w:ilvl="1"/>
+    <w:lvlOverride w:ilvl="2"/>
+    <w:lvlOverride w:ilvl="3"/>
+    <w:lvlOverride w:ilvl="4"/>
+    <w:lvlOverride w:ilvl="5"/>
+    <w:lvlOverride w:ilvl="6"/>
+    <w:lvlOverride w:ilvl="7"/>
+    <w:lvlOverride w:ilvl="8"/>
+  </w:num>
+  <w:num w:numId="48" w16cid:durableId="678510929">
+    <w:abstractNumId w:val="32"/>
   </w:num>
 </w:numbering>
 </file>
@@ -9133,7 +11163,6 @@
   <w:style w:type="character" w:default="1" w:styleId="Fuentedeprrafopredeter">
     <w:name w:val="Default Paragraph Font"/>
     <w:uiPriority w:val="1"/>
-    <w:semiHidden/>
     <w:unhideWhenUsed/>
   </w:style>
   <w:style w:type="table" w:default="1" w:styleId="Tablanormal">

</xml_diff>